<commit_message>
docs: Updating some refs
</commit_message>
<xml_diff>
--- a/docs/project/Layla (Documento de Proyecto).docx
+++ b/docs/project/Layla (Documento de Proyecto).docx
@@ -110,6 +110,27 @@
                                   </w:p>
                                 </w:sdtContent>
                               </w:sdt>
+                              <w:p>
+                                <w:pPr>
+                                  <w:pStyle w:val="Sinespaciado"/>
+                                  <w:jc w:val="right"/>
+                                  <w:rPr>
+                                    <w:caps/>
+                                    <w:color w:val="262626" w:themeColor="text1" w:themeTint="D9"/>
+                                    <w:sz w:val="28"/>
+                                    <w:szCs w:val="28"/>
+                                  </w:rPr>
+                                </w:pPr>
+                                <w:r>
+                                  <w:rPr>
+                                    <w:caps/>
+                                    <w:color w:val="262626" w:themeColor="text1" w:themeTint="D9"/>
+                                    <w:sz w:val="28"/>
+                                    <w:szCs w:val="28"/>
+                                  </w:rPr>
+                                  <w:t>rODOLFO FERNANDEZ RODRIGUEZ</w:t>
+                                </w:r>
+                              </w:p>
                               <w:p>
                                 <w:pPr>
                                   <w:pStyle w:val="Sinespaciado"/>
@@ -328,6 +349,27 @@
                             </w:p>
                           </w:sdtContent>
                         </w:sdt>
+                        <w:p>
+                          <w:pPr>
+                            <w:pStyle w:val="Sinespaciado"/>
+                            <w:jc w:val="right"/>
+                            <w:rPr>
+                              <w:caps/>
+                              <w:color w:val="262626" w:themeColor="text1" w:themeTint="D9"/>
+                              <w:sz w:val="28"/>
+                              <w:szCs w:val="28"/>
+                            </w:rPr>
+                          </w:pPr>
+                          <w:r>
+                            <w:rPr>
+                              <w:caps/>
+                              <w:color w:val="262626" w:themeColor="text1" w:themeTint="D9"/>
+                              <w:sz w:val="28"/>
+                              <w:szCs w:val="28"/>
+                            </w:rPr>
+                            <w:t>rODOLFO FERNANDEZ RODRIGUEZ</w:t>
+                          </w:r>
+                        </w:p>
                         <w:p>
                           <w:pPr>
                             <w:pStyle w:val="Sinespaciado"/>
@@ -4881,15 +4923,7 @@
               <w:cnfStyle w:val="000000000000" w:firstRow="0" w:lastRow="0" w:firstColumn="0" w:lastColumn="0" w:oddVBand="0" w:evenVBand="0" w:oddHBand="0" w:evenHBand="0" w:firstRowFirstColumn="0" w:firstRowLastColumn="0" w:lastRowFirstColumn="0" w:lastRowLastColumn="0"/>
             </w:pPr>
             <w:r>
-              <w:t xml:space="preserve">Configuración de mecanismos de resiliencia y </w:t>
-            </w:r>
-            <w:proofErr w:type="spellStart"/>
-            <w:r>
-              <w:t>auto-recuperación</w:t>
-            </w:r>
-            <w:proofErr w:type="spellEnd"/>
-            <w:r>
-              <w:t xml:space="preserve"> (Self-Healing).</w:t>
+              <w:t>Configuración de mecanismos de resiliencia y auto-recuperación (Self-Healing).</w:t>
             </w:r>
           </w:p>
           <w:p>
@@ -4902,15 +4936,7 @@
               <w:cnfStyle w:val="000000000000" w:firstRow="0" w:lastRow="0" w:firstColumn="0" w:lastColumn="0" w:oddVBand="0" w:evenVBand="0" w:oddHBand="0" w:evenHBand="0" w:firstRowFirstColumn="0" w:firstRowLastColumn="0" w:lastRowFirstColumn="0" w:lastRowLastColumn="0"/>
             </w:pPr>
             <w:r>
-              <w:t xml:space="preserve">Creación del Apéndice A: </w:t>
-            </w:r>
-            <w:proofErr w:type="spellStart"/>
-            <w:r>
-              <w:t>Roadmap</w:t>
-            </w:r>
-            <w:proofErr w:type="spellEnd"/>
-            <w:r>
-              <w:t xml:space="preserve"> Tecnológico y Evolución a Layla 2.0.</w:t>
+              <w:t>Creación del Apéndice A: Roadmap Tecnológico y Evolución a Layla 2.0.</w:t>
             </w:r>
           </w:p>
         </w:tc>
@@ -4944,7 +4970,6 @@
       <w:r>
         <w:t>, surge como una solución integral para autores y constructores de universos (</w:t>
       </w:r>
-      <w:proofErr w:type="spellStart"/>
       <w:r>
         <w:rPr>
           <w:i/>
@@ -4952,7 +4977,6 @@
         </w:rPr>
         <w:t>worldbuilders</w:t>
       </w:r>
-      <w:proofErr w:type="spellEnd"/>
       <w:r>
         <w:t>) que requieren un entorno centralizado para la gestión narrativa.</w:t>
       </w:r>
@@ -5043,15 +5067,7 @@
         <w:t>Comunicación Inter-Servicios:</w:t>
       </w:r>
       <w:r>
-        <w:t xml:space="preserve"> Ambos </w:t>
-      </w:r>
-      <w:proofErr w:type="spellStart"/>
-      <w:r>
-        <w:t>backends</w:t>
-      </w:r>
-      <w:proofErr w:type="spellEnd"/>
-      <w:r>
-        <w:t xml:space="preserve"> se comunican mediante</w:t>
+        <w:t xml:space="preserve"> Ambos backends se comunican mediante</w:t>
       </w:r>
       <w:r>
         <w:t xml:space="preserve"> </w:t>
@@ -5195,15 +5211,7 @@
               <w:cnfStyle w:val="100000000000" w:firstRow="1" w:lastRow="0" w:firstColumn="0" w:lastColumn="0" w:oddVBand="0" w:evenVBand="0" w:oddHBand="0" w:evenHBand="0" w:firstRowFirstColumn="0" w:firstRowLastColumn="0" w:lastRowFirstColumn="0" w:lastRowLastColumn="0"/>
             </w:pPr>
             <w:r>
-              <w:t>Semana (</w:t>
-            </w:r>
-            <w:proofErr w:type="spellStart"/>
-            <w:r>
-              <w:t>Est</w:t>
-            </w:r>
-            <w:proofErr w:type="spellEnd"/>
-            <w:r>
-              <w:t>.)</w:t>
+              <w:t>Semana (Est.)</w:t>
             </w:r>
           </w:p>
         </w:tc>
@@ -5301,13 +5309,8 @@
               <w:spacing w:after="160" w:line="278" w:lineRule="auto"/>
               <w:cnfStyle w:val="000000100000" w:firstRow="0" w:lastRow="0" w:firstColumn="0" w:lastColumn="0" w:oddVBand="0" w:evenVBand="0" w:oddHBand="1" w:evenHBand="0" w:firstRowFirstColumn="0" w:firstRowLastColumn="0" w:lastRowFirstColumn="0" w:lastRowLastColumn="0"/>
             </w:pPr>
-            <w:proofErr w:type="spellStart"/>
-            <w:r>
-              <w:t>docker-compose</w:t>
-            </w:r>
-            <w:proofErr w:type="spellEnd"/>
-            <w:r>
-              <w:t xml:space="preserve"> operativo con SQL Server, Mongo y API .NET respondiendo HTTP 200 OK.</w:t>
+            <w:r>
+              <w:t>docker-compose operativo con SQL Server, Mongo y API .NET respondiendo HTTP 200 OK.</w:t>
             </w:r>
           </w:p>
         </w:tc>
@@ -5502,15 +5505,7 @@
               <w:cnfStyle w:val="000000000000" w:firstRow="0" w:lastRow="0" w:firstColumn="0" w:lastColumn="0" w:oddVBand="0" w:evenVBand="0" w:oddHBand="0" w:evenHBand="0" w:firstRowFirstColumn="0" w:firstRowLastColumn="0" w:lastRowFirstColumn="0" w:lastRowLastColumn="0"/>
             </w:pPr>
             <w:r>
-              <w:t xml:space="preserve">Integración de </w:t>
-            </w:r>
-            <w:proofErr w:type="spellStart"/>
-            <w:r>
-              <w:t>RichTextBox</w:t>
-            </w:r>
-            <w:proofErr w:type="spellEnd"/>
-            <w:r>
-              <w:t xml:space="preserve"> en WPF. Guardado de contenido extenso en MongoDB.</w:t>
+              <w:t>Integración de RichTextBox en WPF. Guardado de contenido extenso en MongoDB.</w:t>
             </w:r>
           </w:p>
         </w:tc>
@@ -5708,15 +5703,7 @@
               <w:cnfStyle w:val="000000100000" w:firstRow="0" w:lastRow="0" w:firstColumn="0" w:lastColumn="0" w:oddVBand="0" w:evenVBand="0" w:oddHBand="1" w:evenHBand="0" w:firstRowFirstColumn="0" w:firstRowLastColumn="0" w:lastRowFirstColumn="0" w:lastRowLastColumn="0"/>
             </w:pPr>
             <w:r>
-              <w:t xml:space="preserve">Implementación de RabbitMQ. Evento </w:t>
-            </w:r>
-            <w:proofErr w:type="spellStart"/>
-            <w:r>
-              <w:t>ProjectCreated</w:t>
-            </w:r>
-            <w:proofErr w:type="spellEnd"/>
-            <w:r>
-              <w:t xml:space="preserve"> en .NET dispara creación de nodo en Neo4j.</w:t>
+              <w:t>Implementación de RabbitMQ. Evento ProjectCreated en .NET dispara creación de nodo en Neo4j.</w:t>
             </w:r>
           </w:p>
         </w:tc>
@@ -5782,15 +5769,7 @@
               <w:cnfStyle w:val="000000000000" w:firstRow="0" w:lastRow="0" w:firstColumn="0" w:lastColumn="0" w:oddVBand="0" w:evenVBand="0" w:oddHBand="0" w:evenHBand="0" w:firstRowFirstColumn="0" w:firstRowLastColumn="0" w:lastRowFirstColumn="0" w:lastRowLastColumn="0"/>
             </w:pPr>
             <w:r>
-              <w:t>Cliente Razor Pages desplegado. Visualización de lista de proyectos públicos (</w:t>
-            </w:r>
-            <w:proofErr w:type="spellStart"/>
-            <w:r>
-              <w:t>Feed</w:t>
-            </w:r>
-            <w:proofErr w:type="spellEnd"/>
-            <w:r>
-              <w:t>).</w:t>
+              <w:t>Cliente Razor Pages desplegado. Visualización de lista de proyectos públicos (Feed).</w:t>
             </w:r>
           </w:p>
         </w:tc>
@@ -5968,59 +5947,84 @@
               <w:spacing w:after="160" w:line="278" w:lineRule="auto"/>
               <w:cnfStyle w:val="000000100000" w:firstRow="0" w:lastRow="0" w:firstColumn="0" w:lastColumn="0" w:oddVBand="0" w:evenVBand="0" w:oddHBand="1" w:evenHBand="0" w:firstRowFirstColumn="0" w:firstRowLastColumn="0" w:lastRowFirstColumn="0" w:lastRowLastColumn="0"/>
             </w:pPr>
-            <w:proofErr w:type="spellStart"/>
             <w:r>
               <w:rPr>
                 <w:b/>
                 <w:bCs/>
               </w:rPr>
-              <w:t>Streaming</w:t>
-            </w:r>
-            <w:proofErr w:type="spellEnd"/>
+              <w:t>Streaming de Audio</w:t>
+            </w:r>
+          </w:p>
+        </w:tc>
+        <w:tc>
+          <w:tcPr>
+            <w:tcW w:w="0" w:type="auto"/>
+            <w:hideMark/>
+          </w:tcPr>
+          <w:p>
+            <w:pPr>
+              <w:spacing w:after="160" w:line="278" w:lineRule="auto"/>
+              <w:cnfStyle w:val="000000100000" w:firstRow="0" w:lastRow="0" w:firstColumn="0" w:lastColumn="0" w:oddVBand="0" w:evenVBand="0" w:oddHBand="1" w:evenHBand="0" w:firstRowFirstColumn="0" w:firstRowLastColumn="0" w:lastRowFirstColumn="0" w:lastRowLastColumn="0"/>
+            </w:pPr>
+            <w:r>
+              <w:t>Módulo de Voz en Android</w:t>
+            </w:r>
+            <w:r>
+              <w:t xml:space="preserve">. </w:t>
+            </w:r>
+            <w:r>
+              <w:t>Pruebas de latencia en red local.</w:t>
+            </w:r>
+          </w:p>
+        </w:tc>
+      </w:tr>
+      <w:tr>
+        <w:tc>
+          <w:tcPr>
+            <w:cnfStyle w:val="001000000000" w:firstRow="0" w:lastRow="0" w:firstColumn="1" w:lastColumn="0" w:oddVBand="0" w:evenVBand="0" w:oddHBand="0" w:evenHBand="0" w:firstRowFirstColumn="0" w:firstRowLastColumn="0" w:lastRowFirstColumn="0" w:lastRowLastColumn="0"/>
+            <w:tcW w:w="0" w:type="auto"/>
+            <w:hideMark/>
+          </w:tcPr>
+          <w:p>
+            <w:pPr>
+              <w:spacing w:after="160" w:line="278" w:lineRule="auto"/>
+            </w:pPr>
+            <w:r>
+              <w:t>VI. Cierre</w:t>
+            </w:r>
+          </w:p>
+        </w:tc>
+        <w:tc>
+          <w:tcPr>
+            <w:tcW w:w="0" w:type="auto"/>
+            <w:hideMark/>
+          </w:tcPr>
+          <w:p>
+            <w:pPr>
+              <w:spacing w:after="160" w:line="278" w:lineRule="auto"/>
+              <w:cnfStyle w:val="000000000000" w:firstRow="0" w:lastRow="0" w:firstColumn="0" w:lastColumn="0" w:oddVBand="0" w:evenVBand="0" w:oddHBand="0" w:evenHBand="0" w:firstRowFirstColumn="0" w:firstRowLastColumn="0" w:lastRowFirstColumn="0" w:lastRowLastColumn="0"/>
+            </w:pPr>
+            <w:r>
+              <w:t>Semana 12</w:t>
+            </w:r>
+          </w:p>
+        </w:tc>
+        <w:tc>
+          <w:tcPr>
+            <w:tcW w:w="0" w:type="auto"/>
+            <w:hideMark/>
+          </w:tcPr>
+          <w:p>
+            <w:pPr>
+              <w:spacing w:after="160" w:line="278" w:lineRule="auto"/>
+              <w:cnfStyle w:val="000000000000" w:firstRow="0" w:lastRow="0" w:firstColumn="0" w:lastColumn="0" w:oddVBand="0" w:evenVBand="0" w:oddHBand="0" w:evenHBand="0" w:firstRowFirstColumn="0" w:firstRowLastColumn="0" w:lastRowFirstColumn="0" w:lastRowLastColumn="0"/>
+            </w:pPr>
             <w:r>
               <w:rPr>
                 <w:b/>
                 <w:bCs/>
               </w:rPr>
-              <w:t xml:space="preserve"> de Audio</w:t>
-            </w:r>
-          </w:p>
-        </w:tc>
-        <w:tc>
-          <w:tcPr>
-            <w:tcW w:w="0" w:type="auto"/>
-            <w:hideMark/>
-          </w:tcPr>
-          <w:p>
-            <w:pPr>
-              <w:spacing w:after="160" w:line="278" w:lineRule="auto"/>
-              <w:cnfStyle w:val="000000100000" w:firstRow="0" w:lastRow="0" w:firstColumn="0" w:lastColumn="0" w:oddVBand="0" w:evenVBand="0" w:oddHBand="1" w:evenHBand="0" w:firstRowFirstColumn="0" w:firstRowLastColumn="0" w:lastRowFirstColumn="0" w:lastRowLastColumn="0"/>
-            </w:pPr>
-            <w:r>
-              <w:t>Módulo de Voz en Android</w:t>
-            </w:r>
-            <w:r>
-              <w:t xml:space="preserve">. </w:t>
-            </w:r>
-            <w:r>
-              <w:t>Pruebas de latencia en red local.</w:t>
-            </w:r>
-          </w:p>
-        </w:tc>
-      </w:tr>
-      <w:tr>
-        <w:tc>
-          <w:tcPr>
-            <w:cnfStyle w:val="001000000000" w:firstRow="0" w:lastRow="0" w:firstColumn="1" w:lastColumn="0" w:oddVBand="0" w:evenVBand="0" w:oddHBand="0" w:evenHBand="0" w:firstRowFirstColumn="0" w:firstRowLastColumn="0" w:lastRowFirstColumn="0" w:lastRowLastColumn="0"/>
-            <w:tcW w:w="0" w:type="auto"/>
-            <w:hideMark/>
-          </w:tcPr>
-          <w:p>
-            <w:pPr>
-              <w:spacing w:after="160" w:line="278" w:lineRule="auto"/>
-            </w:pPr>
-            <w:r>
-              <w:t>VI. Cierre</w:t>
+              <w:t>Resiliencia y Defensa</w:t>
             </w:r>
           </w:p>
         </w:tc>
@@ -6035,57 +6039,7 @@
               <w:cnfStyle w:val="000000000000" w:firstRow="0" w:lastRow="0" w:firstColumn="0" w:lastColumn="0" w:oddVBand="0" w:evenVBand="0" w:oddHBand="0" w:evenHBand="0" w:firstRowFirstColumn="0" w:firstRowLastColumn="0" w:lastRowFirstColumn="0" w:lastRowLastColumn="0"/>
             </w:pPr>
             <w:r>
-              <w:t>Semana 12</w:t>
-            </w:r>
-          </w:p>
-        </w:tc>
-        <w:tc>
-          <w:tcPr>
-            <w:tcW w:w="0" w:type="auto"/>
-            <w:hideMark/>
-          </w:tcPr>
-          <w:p>
-            <w:pPr>
-              <w:spacing w:after="160" w:line="278" w:lineRule="auto"/>
-              <w:cnfStyle w:val="000000000000" w:firstRow="0" w:lastRow="0" w:firstColumn="0" w:lastColumn="0" w:oddVBand="0" w:evenVBand="0" w:oddHBand="0" w:evenHBand="0" w:firstRowFirstColumn="0" w:firstRowLastColumn="0" w:lastRowFirstColumn="0" w:lastRowLastColumn="0"/>
-            </w:pPr>
-            <w:r>
-              <w:rPr>
-                <w:b/>
-                <w:bCs/>
-              </w:rPr>
-              <w:t>Resiliencia y Defensa</w:t>
-            </w:r>
-          </w:p>
-        </w:tc>
-        <w:tc>
-          <w:tcPr>
-            <w:tcW w:w="0" w:type="auto"/>
-            <w:hideMark/>
-          </w:tcPr>
-          <w:p>
-            <w:pPr>
-              <w:spacing w:after="160" w:line="278" w:lineRule="auto"/>
-              <w:cnfStyle w:val="000000000000" w:firstRow="0" w:lastRow="0" w:firstColumn="0" w:lastColumn="0" w:oddVBand="0" w:evenVBand="0" w:oddHBand="0" w:evenHBand="0" w:firstRowFirstColumn="0" w:firstRowLastColumn="0" w:lastRowFirstColumn="0" w:lastRowLastColumn="0"/>
-            </w:pPr>
-            <w:r>
-              <w:t xml:space="preserve">Configuración de </w:t>
-            </w:r>
-            <w:proofErr w:type="spellStart"/>
-            <w:r>
-              <w:t>restart</w:t>
-            </w:r>
-            <w:proofErr w:type="spellEnd"/>
-            <w:r>
-              <w:t xml:space="preserve"> </w:t>
-            </w:r>
-            <w:proofErr w:type="spellStart"/>
-            <w:r>
-              <w:t>policies</w:t>
-            </w:r>
-            <w:proofErr w:type="spellEnd"/>
-            <w:r>
-              <w:t xml:space="preserve"> en Docker. Pruebas de estrés y documentación final.</w:t>
+              <w:t>Configuración de restart policies en Docker. Pruebas de estrés y documentación final.</w:t>
             </w:r>
           </w:p>
         </w:tc>
@@ -6179,15 +6133,7 @@
               <w:spacing w:after="160" w:line="278" w:lineRule="auto"/>
             </w:pPr>
             <w:r>
-              <w:t xml:space="preserve">Escaleta (Beat </w:t>
-            </w:r>
-            <w:proofErr w:type="spellStart"/>
-            <w:r>
-              <w:t>Sheet</w:t>
-            </w:r>
-            <w:proofErr w:type="spellEnd"/>
-            <w:r>
-              <w:t>)</w:t>
+              <w:t>Escaleta (Beat Sheet)</w:t>
             </w:r>
           </w:p>
         </w:tc>
@@ -6202,15 +6148,7 @@
               <w:cnfStyle w:val="000000100000" w:firstRow="0" w:lastRow="0" w:firstColumn="0" w:lastColumn="0" w:oddVBand="0" w:evenVBand="0" w:oddHBand="1" w:evenHBand="0" w:firstRowFirstColumn="0" w:firstRowLastColumn="0" w:lastRowFirstColumn="0" w:lastRowLastColumn="0"/>
             </w:pPr>
             <w:r>
-              <w:t>Estructura esquemática de la narración que desglosa la historia en eventos clave o "golpes" (</w:t>
-            </w:r>
-            <w:proofErr w:type="spellStart"/>
-            <w:r>
-              <w:t>beats</w:t>
-            </w:r>
-            <w:proofErr w:type="spellEnd"/>
-            <w:r>
-              <w:t>) antes de escribir el texto completo. En Layla, funciona como el índice dinámico del proyecto.</w:t>
+              <w:t>Estructura esquemática de la narración que desglosa la historia en eventos clave o "golpes" (beats) antes de escribir el texto completo. En Layla, funciona como el índice dinámico del proyecto.</w:t>
             </w:r>
           </w:p>
         </w:tc>
@@ -6549,15 +6487,7 @@
               <w:spacing w:after="160" w:line="278" w:lineRule="auto"/>
             </w:pPr>
             <w:r>
-              <w:t>Push-</w:t>
-            </w:r>
-            <w:proofErr w:type="spellStart"/>
-            <w:r>
-              <w:t>to</w:t>
-            </w:r>
-            <w:proofErr w:type="spellEnd"/>
-            <w:r>
-              <w:t>-Talk (PTT)</w:t>
+              <w:t>Push-to-Talk (PTT)</w:t>
             </w:r>
           </w:p>
         </w:tc>
@@ -6804,15 +6734,7 @@
               <w:spacing w:after="160" w:line="278" w:lineRule="auto"/>
             </w:pPr>
             <w:r>
-              <w:t>Oyente (</w:t>
-            </w:r>
-            <w:proofErr w:type="spellStart"/>
-            <w:r>
-              <w:t>Listener</w:t>
-            </w:r>
-            <w:proofErr w:type="spellEnd"/>
-            <w:r>
-              <w:t>)</w:t>
+              <w:t>Oyente (Listener)</w:t>
             </w:r>
           </w:p>
         </w:tc>
@@ -6827,23 +6749,7 @@
               <w:cnfStyle w:val="000000000000" w:firstRow="0" w:lastRow="0" w:firstColumn="0" w:lastColumn="0" w:oddVBand="0" w:evenVBand="0" w:oddHBand="0" w:evenHBand="0" w:firstRowFirstColumn="0" w:firstRowLastColumn="0" w:lastRowFirstColumn="0" w:lastRowLastColumn="0"/>
             </w:pPr>
             <w:r>
-              <w:t xml:space="preserve">Estado de un usuario en el módulo de voz que puede recibir </w:t>
-            </w:r>
-            <w:proofErr w:type="gramStart"/>
-            <w:r>
-              <w:t>audio</w:t>
-            </w:r>
-            <w:proofErr w:type="gramEnd"/>
-            <w:r>
-              <w:t xml:space="preserve"> pero no tiene permisos para transmitir (</w:t>
-            </w:r>
-            <w:proofErr w:type="spellStart"/>
-            <w:r>
-              <w:t>microfono</w:t>
-            </w:r>
-            <w:proofErr w:type="spellEnd"/>
-            <w:r>
-              <w:t xml:space="preserve"> deshabilitado por el sistema).</w:t>
+              <w:t>Estado de un usuario en el módulo de voz que puede recibir audio pero no tiene permisos para transmitir (microfono deshabilitado por el sistema).</w:t>
             </w:r>
           </w:p>
         </w:tc>
@@ -6862,13 +6768,8 @@
             <w:pPr>
               <w:spacing w:after="160" w:line="278" w:lineRule="auto"/>
             </w:pPr>
-            <w:proofErr w:type="spellStart"/>
-            <w:r>
-              <w:t>Feed</w:t>
-            </w:r>
-            <w:proofErr w:type="spellEnd"/>
-            <w:r>
-              <w:t xml:space="preserve"> Público</w:t>
+            <w:r>
+              <w:t>Feed Público</w:t>
             </w:r>
           </w:p>
         </w:tc>
@@ -7036,15 +6937,7 @@
         <w:t>Capacidad de comunicación:</w:t>
       </w:r>
       <w:r>
-        <w:t xml:space="preserve"> Tiene acceso total al módulo de voz vía WebSockets para transmitir audio (hablar) y recibir audio (escuchar) en sesiones de </w:t>
-      </w:r>
-      <w:proofErr w:type="spellStart"/>
-      <w:r>
-        <w:t>co-escritura</w:t>
-      </w:r>
-      <w:proofErr w:type="spellEnd"/>
-      <w:r>
-        <w:t>.</w:t>
+        <w:t xml:space="preserve"> Tiene acceso total al módulo de voz vía WebSockets para transmitir audio (hablar) y recibir audio (escuchar) en sesiones de co-escritura.</w:t>
       </w:r>
     </w:p>
     <w:p>
@@ -7079,23 +6972,7 @@
           <w:b/>
           <w:bCs/>
         </w:rPr>
-        <w:t>2. Editor (</w:t>
-      </w:r>
-      <w:proofErr w:type="spellStart"/>
-      <w:r>
-        <w:rPr>
-          <w:b/>
-          <w:bCs/>
-        </w:rPr>
-        <w:t>Collaborator</w:t>
-      </w:r>
-      <w:proofErr w:type="spellEnd"/>
-      <w:r>
-        <w:rPr>
-          <w:b/>
-          <w:bCs/>
-        </w:rPr>
-        <w:t>)</w:t>
+        <w:t>2. Editor (Collaborator)</w:t>
       </w:r>
     </w:p>
     <w:p>
@@ -7177,23 +7054,7 @@
           <w:b/>
           <w:bCs/>
         </w:rPr>
-        <w:t>3. Lector Registrado (</w:t>
-      </w:r>
-      <w:proofErr w:type="spellStart"/>
-      <w:r>
-        <w:rPr>
-          <w:b/>
-          <w:bCs/>
-        </w:rPr>
-        <w:t>Registered</w:t>
-      </w:r>
-      <w:proofErr w:type="spellEnd"/>
-      <w:r>
-        <w:rPr>
-          <w:b/>
-          <w:bCs/>
-        </w:rPr>
-        <w:t xml:space="preserve"> Reader)</w:t>
+        <w:t>3. Lector Registrado (Registered Reader)</w:t>
       </w:r>
     </w:p>
     <w:p>
@@ -8162,15 +8023,7 @@
               <w:cnfStyle w:val="000000100000" w:firstRow="0" w:lastRow="0" w:firstColumn="0" w:lastColumn="0" w:oddVBand="0" w:evenVBand="0" w:oddHBand="1" w:evenHBand="0" w:firstRowFirstColumn="0" w:firstRowLastColumn="0" w:lastRowFirstColumn="0" w:lastRowLastColumn="0"/>
             </w:pPr>
             <w:r>
-              <w:t>Explorar Catálogo Público (</w:t>
-            </w:r>
-            <w:proofErr w:type="spellStart"/>
-            <w:r>
-              <w:t>Feed</w:t>
-            </w:r>
-            <w:proofErr w:type="spellEnd"/>
-            <w:r>
-              <w:t>)</w:t>
+              <w:t>Explorar Catálogo Público (Feed)</w:t>
             </w:r>
           </w:p>
         </w:tc>
@@ -10100,15 +9953,7 @@
               <w:cnfStyle w:val="000000000000" w:firstRow="0" w:lastRow="0" w:firstColumn="0" w:lastColumn="0" w:oddVBand="0" w:evenVBand="0" w:oddHBand="0" w:evenHBand="0" w:firstRowFirstColumn="0" w:firstRowLastColumn="0" w:lastRowFirstColumn="0" w:lastRowLastColumn="0"/>
             </w:pPr>
             <w:r>
-              <w:t xml:space="preserve">Ingresa Nombre, Correo y </w:t>
-            </w:r>
-            <w:proofErr w:type="spellStart"/>
-            <w:r>
-              <w:t>Password</w:t>
-            </w:r>
-            <w:proofErr w:type="spellEnd"/>
-            <w:r>
-              <w:t>.</w:t>
+              <w:t>Ingresa Nombre, Correo y Password.</w:t>
             </w:r>
           </w:p>
           <w:p>
@@ -10140,15 +9985,7 @@
               <w:cnfStyle w:val="000000000000" w:firstRow="0" w:lastRow="0" w:firstColumn="0" w:lastColumn="0" w:oddVBand="0" w:evenVBand="0" w:oddHBand="0" w:evenHBand="0" w:firstRowFirstColumn="0" w:firstRowLastColumn="0" w:lastRowFirstColumn="0" w:lastRowLastColumn="0"/>
             </w:pPr>
             <w:r>
-              <w:t xml:space="preserve">El Sistema crea el registro y </w:t>
-            </w:r>
-            <w:proofErr w:type="spellStart"/>
-            <w:r>
-              <w:t>loguea</w:t>
-            </w:r>
-            <w:proofErr w:type="spellEnd"/>
-            <w:r>
-              <w:t xml:space="preserve"> automáticamente al usuario (va al paso 6 del FN).</w:t>
+              <w:t>El Sistema crea el registro y loguea automáticamente al usuario (va al paso 6 del FN).</w:t>
             </w:r>
           </w:p>
         </w:tc>
@@ -10271,23 +10108,7 @@
               <w:t>POS-1:</w:t>
             </w:r>
             <w:r>
-              <w:t xml:space="preserve"> El cliente (Web/WPF/Android) almacena el JWT en almacenamiento seguro (</w:t>
-            </w:r>
-            <w:proofErr w:type="spellStart"/>
-            <w:r>
-              <w:t>HttpOnly</w:t>
-            </w:r>
-            <w:proofErr w:type="spellEnd"/>
-            <w:r>
-              <w:t xml:space="preserve"> Cookie o </w:t>
-            </w:r>
-            <w:proofErr w:type="spellStart"/>
-            <w:r>
-              <w:t>SecureStorage</w:t>
-            </w:r>
-            <w:proofErr w:type="spellEnd"/>
-            <w:r>
-              <w:t>).</w:t>
+              <w:t xml:space="preserve"> El cliente (Web/WPF/Android) almacena el JWT en almacenamiento seguro (HttpOnly Cookie o SecureStorage).</w:t>
             </w:r>
           </w:p>
           <w:p>
@@ -10354,15 +10175,7 @@
               <w:t>RN-01:</w:t>
             </w:r>
             <w:r>
-              <w:t xml:space="preserve"> Las contraseñas deben ser almacenadas utilizando un algoritmo de hash robusto (ej. </w:t>
-            </w:r>
-            <w:proofErr w:type="spellStart"/>
-            <w:r>
-              <w:t>BCrypt</w:t>
-            </w:r>
-            <w:proofErr w:type="spellEnd"/>
-            <w:r>
-              <w:t xml:space="preserve"> o Argon2).</w:t>
+              <w:t xml:space="preserve"> Las contraseñas deben ser almacenadas utilizando un algoritmo de hash robusto (ej. BCrypt o Argon2).</w:t>
             </w:r>
           </w:p>
           <w:p>
@@ -11814,15 +11627,7 @@
               <w:cnfStyle w:val="000000100000" w:firstRow="0" w:lastRow="0" w:firstColumn="0" w:lastColumn="0" w:oddVBand="0" w:evenVBand="0" w:oddHBand="1" w:evenHBand="0" w:firstRowFirstColumn="0" w:firstRowLastColumn="0" w:lastRowFirstColumn="0" w:lastRowLastColumn="0"/>
             </w:pPr>
             <w:r>
-              <w:t>El Admin cambia el estado a "Bloqueado" (</w:t>
-            </w:r>
-            <w:proofErr w:type="spellStart"/>
-            <w:r>
-              <w:t>Banned</w:t>
-            </w:r>
-            <w:proofErr w:type="spellEnd"/>
-            <w:r>
-              <w:t>) por violación de términos.</w:t>
+              <w:t>El Admin cambia el estado a "Bloqueado" (Banned) por violación de términos.</w:t>
             </w:r>
           </w:p>
           <w:p>
@@ -11870,15 +11675,7 @@
               <w:cnfStyle w:val="000000100000" w:firstRow="0" w:lastRow="0" w:firstColumn="0" w:lastColumn="0" w:oddVBand="0" w:evenVBand="0" w:oddHBand="1" w:evenHBand="0" w:firstRowFirstColumn="0" w:firstRowLastColumn="0" w:lastRowFirstColumn="0" w:lastRowLastColumn="0"/>
             </w:pPr>
             <w:r>
-              <w:t>El Sistema fuerza el cierre de sesión del usuario afectado (</w:t>
-            </w:r>
-            <w:proofErr w:type="spellStart"/>
-            <w:r>
-              <w:t>Blacklist</w:t>
-            </w:r>
-            <w:proofErr w:type="spellEnd"/>
-            <w:r>
-              <w:t xml:space="preserve"> de tokens).</w:t>
+              <w:t>El Sistema fuerza el cierre de sesión del usuario afectado (Blacklist de tokens).</w:t>
             </w:r>
           </w:p>
           <w:p>
@@ -12090,15 +11887,7 @@
               <w:t>POS-1:</w:t>
             </w:r>
             <w:r>
-              <w:t xml:space="preserve"> El usuario bloqueado recibe un error 403 </w:t>
-            </w:r>
-            <w:proofErr w:type="spellStart"/>
-            <w:r>
-              <w:t>Forbidden</w:t>
-            </w:r>
-            <w:proofErr w:type="spellEnd"/>
-            <w:r>
-              <w:t xml:space="preserve"> en su siguiente intento de acceso a la API.</w:t>
+              <w:t xml:space="preserve"> El usuario bloqueado recibe un error 403 Forbidden en su siguiente intento de acceso a la API.</w:t>
             </w:r>
           </w:p>
         </w:tc>
@@ -12689,15 +12478,7 @@
               <w:cnfStyle w:val="000000100000" w:firstRow="0" w:lastRow="0" w:firstColumn="0" w:lastColumn="0" w:oddVBand="0" w:evenVBand="0" w:oddHBand="1" w:evenHBand="0" w:firstRowFirstColumn="0" w:firstRowLastColumn="0" w:lastRowFirstColumn="0" w:lastRowLastColumn="0"/>
             </w:pPr>
             <w:r>
-              <w:t xml:space="preserve">El Sistema registra la relación </w:t>
-            </w:r>
-            <w:proofErr w:type="spellStart"/>
-            <w:r>
-              <w:t>User</w:t>
-            </w:r>
-            <w:proofErr w:type="spellEnd"/>
-            <w:r>
-              <w:t xml:space="preserve">-Project en </w:t>
+              <w:t xml:space="preserve">El Sistema registra la relación User-Project en </w:t>
             </w:r>
             <w:r>
               <w:rPr>
@@ -12749,15 +12530,7 @@
               <w:cnfStyle w:val="000000100000" w:firstRow="0" w:lastRow="0" w:firstColumn="0" w:lastColumn="0" w:oddVBand="0" w:evenVBand="0" w:oddHBand="1" w:evenHBand="0" w:firstRowFirstColumn="0" w:firstRowLastColumn="0" w:lastRowFirstColumn="0" w:lastRowLastColumn="0"/>
             </w:pPr>
             <w:r>
-              <w:t xml:space="preserve">El Sistema publica el evento </w:t>
-            </w:r>
-            <w:proofErr w:type="spellStart"/>
-            <w:r>
-              <w:t>ProjectCreated</w:t>
-            </w:r>
-            <w:proofErr w:type="spellEnd"/>
-            <w:r>
-              <w:t xml:space="preserve"> en RabbitMQ para inicializar el grafo en Neo4j.</w:t>
+              <w:t>El Sistema publica el evento ProjectCreated en RabbitMQ para inicializar el grafo en Neo4j.</w:t>
             </w:r>
           </w:p>
           <w:p>
@@ -12926,15 +12699,7 @@
               <w:cnfStyle w:val="000000100000" w:firstRow="0" w:lastRow="0" w:firstColumn="0" w:lastColumn="0" w:oddVBand="0" w:evenVBand="0" w:oddHBand="1" w:evenHBand="0" w:firstRowFirstColumn="0" w:firstRowLastColumn="0" w:lastRowFirstColumn="0" w:lastRowLastColumn="0"/>
             </w:pPr>
             <w:r>
-              <w:t xml:space="preserve">Si falla la creación en MongoDB después de insertar en SQL, el sistema hace </w:t>
-            </w:r>
-            <w:proofErr w:type="spellStart"/>
-            <w:r>
-              <w:t>rollback</w:t>
-            </w:r>
-            <w:proofErr w:type="spellEnd"/>
-            <w:r>
-              <w:t xml:space="preserve"> en SQL.</w:t>
+              <w:t>Si falla la creación en MongoDB después de insertar en SQL, el sistema hace rollback en SQL.</w:t>
             </w:r>
           </w:p>
           <w:p>
@@ -13368,15 +13133,7 @@
               <w:cnfStyle w:val="000000100000" w:firstRow="0" w:lastRow="0" w:firstColumn="0" w:lastColumn="0" w:oddVBand="0" w:evenVBand="0" w:oddHBand="1" w:evenHBand="0" w:firstRowFirstColumn="0" w:firstRowLastColumn="0" w:lastRowFirstColumn="0" w:lastRowLastColumn="0"/>
             </w:pPr>
             <w:r>
-              <w:t xml:space="preserve">El Escritor invita a otros usuarios a participar en la obra, asignándoles roles específicos (Editor) para permitir la </w:t>
-            </w:r>
-            <w:proofErr w:type="spellStart"/>
-            <w:r>
-              <w:t>co-autoría</w:t>
-            </w:r>
-            <w:proofErr w:type="spellEnd"/>
-            <w:r>
-              <w:t xml:space="preserve"> o corrección.</w:t>
+              <w:t>El Escritor invita a otros usuarios a participar en la obra, asignándoles roles específicos (Editor) para permitir la co-autoría o corrección.</w:t>
             </w:r>
           </w:p>
         </w:tc>
@@ -14157,15 +13914,7 @@
               <w:cnfStyle w:val="000000100000" w:firstRow="0" w:lastRow="0" w:firstColumn="0" w:lastColumn="0" w:oddVBand="0" w:evenVBand="0" w:oddHBand="1" w:evenHBand="0" w:firstRowFirstColumn="0" w:firstRowLastColumn="0" w:lastRowFirstColumn="0" w:lastRowLastColumn="0"/>
             </w:pPr>
             <w:r>
-              <w:t xml:space="preserve">El Escritor cambia la visibilidad del proyecto para publicarlo en el </w:t>
-            </w:r>
-            <w:proofErr w:type="spellStart"/>
-            <w:r>
-              <w:t>Feed</w:t>
-            </w:r>
-            <w:proofErr w:type="spellEnd"/>
-            <w:r>
-              <w:t xml:space="preserve"> o mantenerlo oculto.</w:t>
+              <w:t>El Escritor cambia la visibilidad del proyecto para publicarlo en el Feed o mantenerlo oculto.</w:t>
             </w:r>
           </w:p>
         </w:tc>
@@ -14399,15 +14148,7 @@
               <w:cnfStyle w:val="000000100000" w:firstRow="0" w:lastRow="0" w:firstColumn="0" w:lastColumn="0" w:oddVBand="0" w:evenVBand="0" w:oddHBand="1" w:evenHBand="0" w:firstRowFirstColumn="0" w:firstRowLastColumn="0" w:lastRowFirstColumn="0" w:lastRowLastColumn="0"/>
             </w:pPr>
             <w:r>
-              <w:t xml:space="preserve">El Sistema actualiza la bandera </w:t>
-            </w:r>
-            <w:proofErr w:type="spellStart"/>
-            <w:r>
-              <w:t>IsPublic</w:t>
-            </w:r>
-            <w:proofErr w:type="spellEnd"/>
-            <w:r>
-              <w:t xml:space="preserve"> = true en SQL Server.</w:t>
+              <w:t>El Sistema actualiza la bandera IsPublic = true en SQL Server.</w:t>
             </w:r>
           </w:p>
           <w:p>
@@ -14423,15 +14164,7 @@
               <w:cnfStyle w:val="000000100000" w:firstRow="0" w:lastRow="0" w:firstColumn="0" w:lastColumn="0" w:oddVBand="0" w:evenVBand="0" w:oddHBand="1" w:evenHBand="0" w:firstRowFirstColumn="0" w:firstRowLastColumn="0" w:lastRowFirstColumn="0" w:lastRowLastColumn="0"/>
             </w:pPr>
             <w:r>
-              <w:t xml:space="preserve">El Sistema indexa el proyecto en el motor de búsqueda del </w:t>
-            </w:r>
-            <w:proofErr w:type="spellStart"/>
-            <w:r>
-              <w:t>Feed</w:t>
-            </w:r>
-            <w:proofErr w:type="spellEnd"/>
-            <w:r>
-              <w:t xml:space="preserve"> Público.</w:t>
+              <w:t>El Sistema indexa el proyecto en el motor de búsqueda del Feed Público.</w:t>
             </w:r>
           </w:p>
           <w:p>
@@ -15103,15 +14836,7 @@
               <w:cnfStyle w:val="000000100000" w:firstRow="0" w:lastRow="0" w:firstColumn="0" w:lastColumn="0" w:oddVBand="0" w:evenVBand="0" w:oddHBand="1" w:evenHBand="0" w:firstRowFirstColumn="0" w:firstRowLastColumn="0" w:lastRowFirstColumn="0" w:lastRowLastColumn="0"/>
             </w:pPr>
             <w:r>
-              <w:t xml:space="preserve">El Sistema renderiza el texto en el control </w:t>
-            </w:r>
-            <w:proofErr w:type="spellStart"/>
-            <w:r>
-              <w:t>RichTextBox</w:t>
-            </w:r>
-            <w:proofErr w:type="spellEnd"/>
-            <w:r>
-              <w:t xml:space="preserve"> de WPF.</w:t>
+              <w:t>El Sistema renderiza el texto en el control RichTextBox de WPF.</w:t>
             </w:r>
           </w:p>
           <w:p>
@@ -15603,15 +15328,7 @@
               <w:cnfStyle w:val="000000000000" w:firstRow="0" w:lastRow="0" w:firstColumn="0" w:lastColumn="0" w:oddVBand="0" w:evenVBand="0" w:oddHBand="0" w:evenHBand="0" w:firstRowFirstColumn="0" w:firstRowLastColumn="0" w:lastRowFirstColumn="0" w:lastRowLastColumn="0"/>
             </w:pPr>
             <w:r>
-              <w:t xml:space="preserve">· Experiencia de escritura fluida (sin </w:t>
-            </w:r>
-            <w:proofErr w:type="spellStart"/>
-            <w:r>
-              <w:t>lag</w:t>
-            </w:r>
-            <w:proofErr w:type="spellEnd"/>
-            <w:r>
-              <w:t xml:space="preserve"> de red).</w:t>
+              <w:t>· Experiencia de escritura fluida (sin lag de red).</w:t>
             </w:r>
           </w:p>
           <w:p>
@@ -16372,15 +16089,7 @@
               <w:t>POS-1:</w:t>
             </w:r>
             <w:r>
-              <w:t xml:space="preserve"> La entidad es </w:t>
-            </w:r>
-            <w:proofErr w:type="spellStart"/>
-            <w:r>
-              <w:t>buscable</w:t>
-            </w:r>
-            <w:proofErr w:type="spellEnd"/>
-            <w:r>
-              <w:t xml:space="preserve"> en la Wiki y aparece visualmente en el grafo.</w:t>
+              <w:t xml:space="preserve"> La entidad es buscable en la Wiki y aparece visualmente en el grafo.</w:t>
             </w:r>
           </w:p>
         </w:tc>
@@ -16428,15 +16137,7 @@
               <w:t>RN-01:</w:t>
             </w:r>
             <w:r>
-              <w:t xml:space="preserve"> Todo nodo debe pertenecer obligatoriamente a un Proyecto (Tenant </w:t>
-            </w:r>
-            <w:proofErr w:type="spellStart"/>
-            <w:r>
-              <w:t>Isolation</w:t>
-            </w:r>
-            <w:proofErr w:type="spellEnd"/>
-            <w:r>
-              <w:t>).</w:t>
+              <w:t xml:space="preserve"> Todo nodo debe pertenecer obligatoriamente a un Proyecto (Tenant Isolation).</w:t>
             </w:r>
           </w:p>
         </w:tc>
@@ -17479,15 +17180,7 @@
               <w:cnfStyle w:val="000000100000" w:firstRow="0" w:lastRow="0" w:firstColumn="0" w:lastColumn="0" w:oddVBand="0" w:evenVBand="0" w:oddHBand="1" w:evenHBand="0" w:firstRowFirstColumn="0" w:firstRowLastColumn="0" w:lastRowFirstColumn="0" w:lastRowLastColumn="0"/>
             </w:pPr>
             <w:r>
-              <w:t>El usuario con rol de colaborador participa activamente en una sesión de voz utilizando el mecanismo Push-</w:t>
-            </w:r>
-            <w:proofErr w:type="spellStart"/>
-            <w:r>
-              <w:t>to</w:t>
-            </w:r>
-            <w:proofErr w:type="spellEnd"/>
-            <w:r>
-              <w:t>-Talk para transmitir sus ideas.</w:t>
+              <w:t>El usuario con rol de colaborador participa activamente en una sesión de voz utilizando el mecanismo Push-to-Talk para transmitir sus ideas.</w:t>
             </w:r>
           </w:p>
         </w:tc>
@@ -17691,15 +17384,7 @@
               <w:cnfStyle w:val="000000100000" w:firstRow="0" w:lastRow="0" w:firstColumn="0" w:lastColumn="0" w:oddVBand="0" w:evenVBand="0" w:oddHBand="1" w:evenHBand="0" w:firstRowFirstColumn="0" w:firstRowLastColumn="0" w:lastRowFirstColumn="0" w:lastRowLastColumn="0"/>
             </w:pPr>
             <w:r>
-              <w:t>El Sistema habilita el botón de "Push-</w:t>
-            </w:r>
-            <w:proofErr w:type="spellStart"/>
-            <w:r>
-              <w:t>to</w:t>
-            </w:r>
-            <w:proofErr w:type="spellEnd"/>
-            <w:r>
-              <w:t>-Talk" (PTT).</w:t>
+              <w:t>El Sistema habilita el botón de "Push-to-Talk" (PTT).</w:t>
             </w:r>
           </w:p>
           <w:p>
@@ -17744,7 +17429,6 @@
             <w:r>
               <w:t xml:space="preserve">El Cliente Android captura el audio, lo codifica y lo envía en </w:t>
             </w:r>
-            <w:proofErr w:type="spellStart"/>
             <w:r>
               <w:rPr>
                 <w:i/>
@@ -17752,7 +17436,6 @@
               </w:rPr>
               <w:t>chunks</w:t>
             </w:r>
-            <w:proofErr w:type="spellEnd"/>
             <w:r>
               <w:t xml:space="preserve"> binarios al servidor.</w:t>
             </w:r>
@@ -17954,15 +17637,7 @@
               <w:cnfStyle w:val="000000100000" w:firstRow="0" w:lastRow="0" w:firstColumn="0" w:lastColumn="0" w:oddVBand="0" w:evenVBand="0" w:oddHBand="1" w:evenHBand="0" w:firstRowFirstColumn="0" w:firstRowLastColumn="0" w:lastRowFirstColumn="0" w:lastRowLastColumn="0"/>
             </w:pPr>
             <w:r>
-              <w:t xml:space="preserve">Si se pierde la conexión </w:t>
-            </w:r>
-            <w:proofErr w:type="spellStart"/>
-            <w:r>
-              <w:t>WiFi</w:t>
-            </w:r>
-            <w:proofErr w:type="spellEnd"/>
-            <w:r>
-              <w:t>, la app intenta reconectar 3 veces.</w:t>
+              <w:t>Si se pierde la conexión WiFi, la app intenta reconectar 3 veces.</w:t>
             </w:r>
           </w:p>
           <w:p>
@@ -18068,23 +17743,7 @@
                 <w:b/>
                 <w:bCs/>
               </w:rPr>
-              <w:t>RN-03 (Half-</w:t>
-            </w:r>
-            <w:proofErr w:type="spellStart"/>
-            <w:r>
-              <w:rPr>
-                <w:b/>
-                <w:bCs/>
-              </w:rPr>
-              <w:t>Duplex</w:t>
-            </w:r>
-            <w:proofErr w:type="spellEnd"/>
-            <w:r>
-              <w:rPr>
-                <w:b/>
-                <w:bCs/>
-              </w:rPr>
-              <w:t>):</w:t>
+              <w:t>RN-03 (Half-Duplex):</w:t>
             </w:r>
             <w:r>
               <w:t xml:space="preserve"> Solo un usuario puede transmitir a la vez para evitar eco y saturación.</w:t>
@@ -18541,15 +18200,7 @@
               <w:cnfStyle w:val="000000100000" w:firstRow="0" w:lastRow="0" w:firstColumn="0" w:lastColumn="0" w:oddVBand="0" w:evenVBand="0" w:oddHBand="1" w:evenHBand="0" w:firstRowFirstColumn="0" w:firstRowLastColumn="0" w:lastRowFirstColumn="0" w:lastRowLastColumn="0"/>
             </w:pPr>
             <w:r>
-              <w:t xml:space="preserve">El Sistema establece la conexión </w:t>
-            </w:r>
-            <w:proofErr w:type="spellStart"/>
-            <w:r>
-              <w:t>WebSocket</w:t>
-            </w:r>
-            <w:proofErr w:type="spellEnd"/>
-            <w:r>
-              <w:t xml:space="preserve"> en modo "Solo Escucha".</w:t>
+              <w:t>El Sistema establece la conexión WebSocket en modo "Solo Escucha".</w:t>
             </w:r>
           </w:p>
           <w:p>
@@ -19127,15 +18778,7 @@
               <w:cnfStyle w:val="000000100000" w:firstRow="0" w:lastRow="0" w:firstColumn="0" w:lastColumn="0" w:oddVBand="0" w:evenVBand="0" w:oddHBand="1" w:evenHBand="0" w:firstRowFirstColumn="0" w:firstRowLastColumn="0" w:lastRowFirstColumn="0" w:lastRowLastColumn="0"/>
             </w:pPr>
             <w:r>
-              <w:t>El usuario navega por el "</w:t>
-            </w:r>
-            <w:proofErr w:type="spellStart"/>
-            <w:r>
-              <w:t>Feed</w:t>
-            </w:r>
-            <w:proofErr w:type="spellEnd"/>
-            <w:r>
-              <w:t>" o catálogo de descubrimiento, visualizando las portadas y sinopsis de las obras que han sido marcadas como públicas por sus autores.</w:t>
+              <w:t>El usuario navega por el "Feed" o catálogo de descubrimiento, visualizando las portadas y sinopsis de las obras que han sido marcadas como públicas por sus autores.</w:t>
             </w:r>
           </w:p>
         </w:tc>
@@ -19305,15 +18948,7 @@
               <w:cnfStyle w:val="000000100000" w:firstRow="0" w:lastRow="0" w:firstColumn="0" w:lastColumn="0" w:oddVBand="0" w:evenVBand="0" w:oddHBand="1" w:evenHBand="0" w:firstRowFirstColumn="0" w:firstRowLastColumn="0" w:lastRowFirstColumn="0" w:lastRowLastColumn="0"/>
             </w:pPr>
             <w:r>
-              <w:t xml:space="preserve">El Sistema consulta en SQL Server los proyectos con la bandera </w:t>
-            </w:r>
-            <w:proofErr w:type="spellStart"/>
-            <w:r>
-              <w:t>IsPublic</w:t>
-            </w:r>
-            <w:proofErr w:type="spellEnd"/>
-            <w:r>
-              <w:t xml:space="preserve"> = true.</w:t>
+              <w:t>El Sistema consulta en SQL Server los proyectos con la bandera IsPublic = true.</w:t>
             </w:r>
           </w:p>
           <w:p>
@@ -19345,15 +18980,7 @@
               <w:cnfStyle w:val="000000100000" w:firstRow="0" w:lastRow="0" w:firstColumn="0" w:lastColumn="0" w:oddVBand="0" w:evenVBand="0" w:oddHBand="1" w:evenHBand="0" w:firstRowFirstColumn="0" w:firstRowLastColumn="0" w:lastRowFirstColumn="0" w:lastRowLastColumn="0"/>
             </w:pPr>
             <w:r>
-              <w:t>El Sistema renderiza una cuadrícula (</w:t>
-            </w:r>
-            <w:proofErr w:type="spellStart"/>
-            <w:r>
-              <w:t>Grid</w:t>
-            </w:r>
-            <w:proofErr w:type="spellEnd"/>
-            <w:r>
-              <w:t>) de tarjetas de proyectos.</w:t>
+              <w:t>El Sistema renderiza una cuadrícula (Grid) de tarjetas de proyectos.</w:t>
             </w:r>
           </w:p>
           <w:p>
@@ -19369,15 +18996,7 @@
               <w:cnfStyle w:val="000000100000" w:firstRow="0" w:lastRow="0" w:firstColumn="0" w:lastColumn="0" w:oddVBand="0" w:evenVBand="0" w:oddHBand="1" w:evenHBand="0" w:firstRowFirstColumn="0" w:firstRowLastColumn="0" w:lastRowFirstColumn="0" w:lastRowLastColumn="0"/>
             </w:pPr>
             <w:r>
-              <w:t xml:space="preserve">El Usuario hace </w:t>
-            </w:r>
-            <w:proofErr w:type="spellStart"/>
-            <w:r>
-              <w:t>scroll</w:t>
-            </w:r>
-            <w:proofErr w:type="spellEnd"/>
-            <w:r>
-              <w:t xml:space="preserve"> para ver más obras.</w:t>
+              <w:t>El Usuario hace scroll para ver más obras.</w:t>
             </w:r>
           </w:p>
           <w:p>
@@ -19393,15 +19012,7 @@
               <w:cnfStyle w:val="000000100000" w:firstRow="0" w:lastRow="0" w:firstColumn="0" w:lastColumn="0" w:oddVBand="0" w:evenVBand="0" w:oddHBand="1" w:evenHBand="0" w:firstRowFirstColumn="0" w:firstRowLastColumn="0" w:lastRowFirstColumn="0" w:lastRowLastColumn="0"/>
             </w:pPr>
             <w:r>
-              <w:t xml:space="preserve">El Sistema carga más elementos bajo demanda (Paginación o Infinite </w:t>
-            </w:r>
-            <w:proofErr w:type="spellStart"/>
-            <w:r>
-              <w:t>Scroll</w:t>
-            </w:r>
-            <w:proofErr w:type="spellEnd"/>
-            <w:r>
-              <w:t>).</w:t>
+              <w:t>El Sistema carga más elementos bajo demanda (Paginación o Infinite Scroll).</w:t>
             </w:r>
           </w:p>
           <w:p>
@@ -20656,15 +20267,7 @@
               <w:cnfStyle w:val="000000000000" w:firstRow="0" w:lastRow="0" w:firstColumn="0" w:lastColumn="0" w:oddVBand="0" w:evenVBand="0" w:oddHBand="0" w:evenHBand="0" w:firstRowFirstColumn="0" w:firstRowLastColumn="0" w:lastRowFirstColumn="0" w:lastRowLastColumn="0"/>
             </w:pPr>
             <w:r>
-              <w:t>Lector (</w:t>
-            </w:r>
-            <w:proofErr w:type="spellStart"/>
-            <w:r>
-              <w:t>Registered</w:t>
-            </w:r>
-            <w:proofErr w:type="spellEnd"/>
-            <w:r>
-              <w:t xml:space="preserve"> Reader).</w:t>
+              <w:t>Lector (Registered Reader).</w:t>
             </w:r>
           </w:p>
         </w:tc>
@@ -21502,23 +21105,7 @@
           <w:b/>
           <w:bCs/>
         </w:rPr>
-        <w:t>Bajo Código y Alta Eficiencia (Low-Code / High-</w:t>
-      </w:r>
-      <w:proofErr w:type="spellStart"/>
-      <w:r>
-        <w:rPr>
-          <w:b/>
-          <w:bCs/>
-        </w:rPr>
-        <w:t>Efficiency</w:t>
-      </w:r>
-      <w:proofErr w:type="spellEnd"/>
-      <w:r>
-        <w:rPr>
-          <w:b/>
-          <w:bCs/>
-        </w:rPr>
-        <w:t>)</w:t>
+        <w:t>Bajo Código y Alta Eficiencia (Low-Code / High-Efficiency)</w:t>
       </w:r>
       <w:r>
         <w:t>. El objetivo es priorizar la funcionalidad distribuida y la heterogeneidad sobre la complejidad visual.</w:t>
@@ -21552,15 +21139,7 @@
         <w:t>arquitectura de navegación segmentada</w:t>
       </w:r>
       <w:r>
-        <w:t xml:space="preserve">, donde cada cliente se especializa en una tarea única para evitar la duplicidad de lógica compleja en el </w:t>
-      </w:r>
-      <w:proofErr w:type="spellStart"/>
-      <w:r>
-        <w:t>frontend</w:t>
-      </w:r>
-      <w:proofErr w:type="spellEnd"/>
-      <w:r>
-        <w:t>:</w:t>
+        <w:t>, donde cada cliente se especializa en una tarea única para evitar la duplicidad de lógica compleja en el frontend:</w:t>
       </w:r>
     </w:p>
     <w:p>
@@ -21588,15 +21167,7 @@
         <w:t>Deep Work</w:t>
       </w:r>
       <w:r>
-        <w:t>). Su navegación se basa en pestañas (</w:t>
-      </w:r>
-      <w:proofErr w:type="spellStart"/>
-      <w:r>
-        <w:t>TabControl</w:t>
-      </w:r>
-      <w:proofErr w:type="spellEnd"/>
-      <w:r>
-        <w:t>) dentro de un espacio de trabajo único, eliminando la necesidad de múltiples ventanas emergentes.</w:t>
+        <w:t>). Su navegación se basa en pestañas (TabControl) dentro de un espacio de trabajo único, eliminando la necesidad de múltiples ventanas emergentes.</w:t>
       </w:r>
     </w:p>
     <w:p>
@@ -21614,23 +21185,7 @@
         <w:t>Cliente Web (Razor Pages):</w:t>
       </w:r>
       <w:r>
-        <w:t xml:space="preserve"> Centraliza la gestión y el consumo. Su flujo distingue roles </w:t>
-      </w:r>
-      <w:proofErr w:type="spellStart"/>
-      <w:r>
-        <w:t>post-login</w:t>
-      </w:r>
-      <w:proofErr w:type="spellEnd"/>
-      <w:r>
-        <w:t xml:space="preserve">: los administradores son dirigidos al Dashboard y los usuarios estándar al </w:t>
-      </w:r>
-      <w:proofErr w:type="spellStart"/>
-      <w:r>
-        <w:t>Feed</w:t>
-      </w:r>
-      <w:proofErr w:type="spellEnd"/>
-      <w:r>
-        <w:t xml:space="preserve"> Público.</w:t>
+        <w:t xml:space="preserve"> Centraliza la gestión y el consumo. Su flujo distingue roles post-login: los administradores son dirigidos al Dashboard y los usuarios estándar al Feed Público.</w:t>
       </w:r>
     </w:p>
     <w:p>
@@ -21701,25 +21256,7 @@
         <w:t>Editor de Texto:</w:t>
       </w:r>
       <w:r>
-        <w:t xml:space="preserve"> Se utilizará el control nativo </w:t>
-      </w:r>
-      <w:proofErr w:type="spellStart"/>
-      <w:proofErr w:type="gramStart"/>
-      <w:r>
-        <w:t>System.Windows.Controls.RichTextBox</w:t>
-      </w:r>
-      <w:proofErr w:type="spellEnd"/>
-      <w:proofErr w:type="gramEnd"/>
-      <w:r>
-        <w:t xml:space="preserve">. El contenido se persistirá directamente como cadenas XAML/RTF o HTML en MongoDB, evitando la creación de </w:t>
-      </w:r>
-      <w:proofErr w:type="spellStart"/>
-      <w:r>
-        <w:t>parsers</w:t>
-      </w:r>
-      <w:proofErr w:type="spellEnd"/>
-      <w:r>
-        <w:t xml:space="preserve"> JSON personalizados.</w:t>
+        <w:t xml:space="preserve"> Se utilizará el control nativo System.Windows.Controls.RichTextBox. El contenido se persistirá directamente como cadenas XAML/RTF o HTML en MongoDB, evitando la creación de parsers JSON personalizados.</w:t>
       </w:r>
     </w:p>
     <w:p>
@@ -21737,23 +21274,7 @@
         <w:t>Visualización de Grafos:</w:t>
       </w:r>
       <w:r>
-        <w:t xml:space="preserve"> Se implementará mediante un </w:t>
-      </w:r>
-      <w:proofErr w:type="spellStart"/>
-      <w:r>
-        <w:t>Canvas</w:t>
-      </w:r>
-      <w:proofErr w:type="spellEnd"/>
-      <w:r>
-        <w:t xml:space="preserve"> estándar de WPF, representando nodos con formas básicas (</w:t>
-      </w:r>
-      <w:proofErr w:type="spellStart"/>
-      <w:r>
-        <w:t>Ellipse</w:t>
-      </w:r>
-      <w:proofErr w:type="spellEnd"/>
-      <w:r>
-        <w:t>) y relaciones con líneas (Line). No se integrarán librerías de física de grafos de terceros; la visualización será estática para cumplir el requisito funcional sin aumentar la carga de procesamiento.</w:t>
+        <w:t xml:space="preserve"> Se implementará mediante un Canvas estándar de WPF, representando nodos con formas básicas (Ellipse) y relaciones con líneas (Line). No se integrarán librerías de física de grafos de terceros; la visualización será estática para cumplir el requisito funcional sin aumentar la carga de procesamiento.</w:t>
       </w:r>
     </w:p>
     <w:p>
@@ -21763,81 +21284,24 @@
           <w:numId w:val="73"/>
         </w:numPr>
       </w:pPr>
-      <w:proofErr w:type="spellStart"/>
       <w:r>
         <w:rPr>
           <w:b/>
           <w:bCs/>
         </w:rPr>
-        <w:t>Layout</w:t>
-      </w:r>
-      <w:proofErr w:type="spellEnd"/>
+        <w:t>Layout:</w:t>
+      </w:r>
+      <w:r>
+        <w:t xml:space="preserve"> Se priorizará el uso de Grid sobre StackPanel para garantizar la escalabilidad de los formularios de la Wiki.</w:t>
+      </w:r>
+    </w:p>
+    <w:p>
       <w:r>
         <w:rPr>
           <w:b/>
           <w:bCs/>
         </w:rPr>
-        <w:t>:</w:t>
-      </w:r>
-      <w:r>
-        <w:t xml:space="preserve"> Se priorizará el uso de </w:t>
-      </w:r>
-      <w:proofErr w:type="spellStart"/>
-      <w:r>
-        <w:t>Grid</w:t>
-      </w:r>
-      <w:proofErr w:type="spellEnd"/>
-      <w:r>
-        <w:t xml:space="preserve"> sobre </w:t>
-      </w:r>
-      <w:proofErr w:type="spellStart"/>
-      <w:r>
-        <w:t>StackPanel</w:t>
-      </w:r>
-      <w:proofErr w:type="spellEnd"/>
-      <w:r>
-        <w:t xml:space="preserve"> para garantizar la escalabilidad de los formularios de la Wiki.</w:t>
-      </w:r>
-    </w:p>
-    <w:p>
-      <w:r>
-        <w:rPr>
-          <w:b/>
-          <w:bCs/>
-        </w:rPr>
-        <w:t>2. Cliente Web (Razor Pages) - Estrategia "Server-</w:t>
-      </w:r>
-      <w:proofErr w:type="spellStart"/>
-      <w:r>
-        <w:rPr>
-          <w:b/>
-          <w:bCs/>
-        </w:rPr>
-        <w:t>Side</w:t>
-      </w:r>
-      <w:proofErr w:type="spellEnd"/>
-      <w:r>
-        <w:rPr>
-          <w:b/>
-          <w:bCs/>
-        </w:rPr>
-        <w:t xml:space="preserve"> </w:t>
-      </w:r>
-      <w:proofErr w:type="spellStart"/>
-      <w:r>
-        <w:rPr>
-          <w:b/>
-          <w:bCs/>
-        </w:rPr>
-        <w:t>Rendering</w:t>
-      </w:r>
-      <w:proofErr w:type="spellEnd"/>
-      <w:r>
-        <w:rPr>
-          <w:b/>
-          <w:bCs/>
-        </w:rPr>
-        <w:t>"</w:t>
+        <w:t>2. Cliente Web (Razor Pages) - Estrategia "Server-Side Rendering"</w:t>
       </w:r>
     </w:p>
     <w:p>
@@ -21865,15 +21329,7 @@
         <w:t>Bootstrap 5</w:t>
       </w:r>
       <w:r>
-        <w:t xml:space="preserve"> para la estructura del Dashboard y el </w:t>
-      </w:r>
-      <w:proofErr w:type="spellStart"/>
-      <w:r>
-        <w:t>Feed</w:t>
-      </w:r>
-      <w:proofErr w:type="spellEnd"/>
-      <w:r>
-        <w:t>, reduciendo el tiempo de maquetado CSS.</w:t>
+        <w:t xml:space="preserve"> para la estructura del Dashboard y el Feed, reduciendo el tiempo de maquetado CSS.</w:t>
       </w:r>
     </w:p>
     <w:p>
@@ -21952,7 +21408,6 @@
       <w:r>
         <w:t xml:space="preserve"> Se utilizarán </w:t>
       </w:r>
-      <w:proofErr w:type="spellStart"/>
       <w:r>
         <w:rPr>
           <w:b/>
@@ -21960,7 +21415,6 @@
         </w:rPr>
         <w:t>Activities</w:t>
       </w:r>
-      <w:proofErr w:type="spellEnd"/>
       <w:r>
         <w:t xml:space="preserve"> nativas estándar en lugar de una arquitectura de </w:t>
       </w:r>
@@ -21969,21 +21423,11 @@
           <w:i/>
           <w:iCs/>
         </w:rPr>
-        <w:t xml:space="preserve">Single </w:t>
-      </w:r>
-      <w:proofErr w:type="spellStart"/>
-      <w:r>
-        <w:rPr>
-          <w:i/>
-          <w:iCs/>
-        </w:rPr>
-        <w:t>Activity</w:t>
-      </w:r>
-      <w:proofErr w:type="spellEnd"/>
+        <w:t>Single Activity</w:t>
+      </w:r>
       <w:r>
         <w:t xml:space="preserve"> con </w:t>
       </w:r>
-      <w:proofErr w:type="spellStart"/>
       <w:r>
         <w:rPr>
           <w:i/>
@@ -21991,7 +21435,6 @@
         </w:rPr>
         <w:t>Fragments</w:t>
       </w:r>
-      <w:proofErr w:type="spellEnd"/>
       <w:r>
         <w:t>, facilitando la gestión del ciclo de vida y la depuración.</w:t>
       </w:r>
@@ -22008,34 +21451,10 @@
           <w:b/>
           <w:bCs/>
         </w:rPr>
-        <w:t>Control PTT (Push-</w:t>
-      </w:r>
-      <w:proofErr w:type="spellStart"/>
-      <w:r>
-        <w:rPr>
-          <w:b/>
-          <w:bCs/>
-        </w:rPr>
-        <w:t>to</w:t>
-      </w:r>
-      <w:proofErr w:type="spellEnd"/>
-      <w:r>
-        <w:rPr>
-          <w:b/>
-          <w:bCs/>
-        </w:rPr>
-        <w:t>-Talk):</w:t>
-      </w:r>
-      <w:r>
-        <w:t xml:space="preserve"> La interfaz de voz se simplificará a un único botón (Button) con un </w:t>
-      </w:r>
-      <w:proofErr w:type="spellStart"/>
-      <w:r>
-        <w:t>OnTouchListener</w:t>
-      </w:r>
-      <w:proofErr w:type="spellEnd"/>
-      <w:r>
-        <w:t>. La retroalimentación visual se limitará a cambios de color de estado (Rojo: Transmitiendo / Gris: Inactivo), evitando animaciones de ondas de audio complejas.</w:t>
+        <w:t>Control PTT (Push-to-Talk):</w:t>
+      </w:r>
+      <w:r>
+        <w:t xml:space="preserve"> La interfaz de voz se simplificará a un único botón (Button) con un OnTouchListener. La retroalimentación visual se limitará a cambios de color de estado (Rojo: Transmitiendo / Gris: Inactivo), evitando animaciones de ondas de audio complejas.</w:t>
       </w:r>
     </w:p>
     <w:p/>
@@ -22229,23 +21648,7 @@
         <w:t xml:space="preserve">Consistencia de Datos y Dispositivos. </w:t>
       </w:r>
       <w:r>
-        <w:t>La aplicación Android funcionará en modo "Companion" (Solo Lectura para manuscritos), garantizando que la fuente de la verdad para la edición de texto sea exclusivamente el Cliente Web. Esto elimina conflictos de concurrencia en la edición simultánea (</w:t>
-      </w:r>
-      <w:proofErr w:type="spellStart"/>
-      <w:r>
-        <w:t>Race</w:t>
-      </w:r>
-      <w:proofErr w:type="spellEnd"/>
-      <w:r>
-        <w:t xml:space="preserve"> </w:t>
-      </w:r>
-      <w:proofErr w:type="spellStart"/>
-      <w:r>
-        <w:t>Conditions</w:t>
-      </w:r>
-      <w:proofErr w:type="spellEnd"/>
-      <w:r>
-        <w:t>).</w:t>
+        <w:t>La aplicación Android funcionará en modo "Companion" (Solo Lectura para manuscritos), garantizando que la fuente de la verdad para la edición de texto sea exclusivamente el Cliente Web. Esto elimina conflictos de concurrencia en la edición simultánea (Race Conditions).</w:t>
       </w:r>
     </w:p>
     <w:p>
@@ -22346,28 +21749,11 @@
           <w:b/>
           <w:bCs/>
         </w:rPr>
-        <w:t>RF-10: Comunicación por Voz (Push-</w:t>
-      </w:r>
-      <w:proofErr w:type="spellStart"/>
-      <w:r>
-        <w:rPr>
-          <w:b/>
-          <w:bCs/>
-        </w:rPr>
-        <w:t>to</w:t>
-      </w:r>
-      <w:proofErr w:type="spellEnd"/>
-      <w:r>
-        <w:rPr>
-          <w:b/>
-          <w:bCs/>
-        </w:rPr>
-        <w:t xml:space="preserve">-Talk). </w:t>
+        <w:t xml:space="preserve">RF-10: Comunicación por Voz (Push-to-Talk). </w:t>
       </w:r>
       <w:r>
         <w:t xml:space="preserve">El sistema implementará un modelo de comunicación por voz tipo </w:t>
       </w:r>
-      <w:proofErr w:type="spellStart"/>
       <w:r>
         <w:rPr>
           <w:i/>
@@ -22375,7 +21761,6 @@
         </w:rPr>
         <w:t>Walkie-Talkie</w:t>
       </w:r>
-      <w:proofErr w:type="spellEnd"/>
       <w:r>
         <w:t xml:space="preserve"> o </w:t>
       </w:r>
@@ -22411,15 +21796,7 @@
         <w:t xml:space="preserve">RF-11: Roles de Voz. </w:t>
       </w:r>
       <w:r>
-        <w:t xml:space="preserve">El sistema distinguirá entre roles de "Emisor" (Escritor/Editor activo) y "Oyente" (Lectores/Invitados), gestionando los canales de audio mediante ASP.NET Core </w:t>
-      </w:r>
-      <w:proofErr w:type="spellStart"/>
-      <w:r>
-        <w:t>SignalR</w:t>
-      </w:r>
-      <w:proofErr w:type="spellEnd"/>
-      <w:r>
-        <w:t>.</w:t>
+        <w:t>El sistema distinguirá entre roles de "Emisor" (Escritor/Editor activo) y "Oyente" (Lectores/Invitados), gestionando los canales de audio mediante ASP.NET Core SignalR.</w:t>
       </w:r>
     </w:p>
     <w:p>
@@ -22563,34 +21940,10 @@
           <w:b/>
           <w:bCs/>
         </w:rPr>
-        <w:t>RF-17: Catálogo de Obras Públicas (</w:t>
-      </w:r>
-      <w:proofErr w:type="spellStart"/>
-      <w:r>
-        <w:rPr>
-          <w:b/>
-          <w:bCs/>
-        </w:rPr>
-        <w:t>Feed</w:t>
-      </w:r>
-      <w:proofErr w:type="spellEnd"/>
-      <w:r>
-        <w:rPr>
-          <w:b/>
-          <w:bCs/>
-        </w:rPr>
-        <w:t>).</w:t>
-      </w:r>
-      <w:r>
-        <w:t xml:space="preserve"> El sistema debe presentar una vista de "Descubrimiento" en el portal web (Razor Pages) que liste las portadas y sinopsis de los proyectos marcados como públicos. Esta lista debe permitir el filtrado por género (ej. Fantasía, </w:t>
-      </w:r>
-      <w:proofErr w:type="spellStart"/>
-      <w:r>
-        <w:t>Sci</w:t>
-      </w:r>
-      <w:proofErr w:type="spellEnd"/>
-      <w:r>
-        <w:t>-Fi) y ordenamiento por "Más Recientes".</w:t>
+        <w:t>RF-17: Catálogo de Obras Públicas (Feed).</w:t>
+      </w:r>
+      <w:r>
+        <w:t xml:space="preserve"> El sistema debe presentar una vista de "Descubrimiento" en el portal web (Razor Pages) que liste las portadas y sinopsis de los proyectos marcados como públicos. Esta lista debe permitir el filtrado por género (ej. Fantasía, Sci-Fi) y ordenamiento por "Más Recientes".</w:t>
       </w:r>
     </w:p>
     <w:p>
@@ -22611,24 +21964,11 @@
       <w:r>
         <w:t xml:space="preserve"> El cliente WPF debe ser capaz de operar con caché local, permitiendo al </w:t>
       </w:r>
-      <w:proofErr w:type="spellStart"/>
       <w:r>
         <w:t>aa</w:t>
       </w:r>
       <w:r>
-        <w:t>escritor</w:t>
-      </w:r>
-      <w:proofErr w:type="spellEnd"/>
-      <w:r>
-        <w:t xml:space="preserve"> continuar redactando en caso de </w:t>
-      </w:r>
-      <w:proofErr w:type="spellStart"/>
-      <w:r>
-        <w:t>micro-cortes</w:t>
-      </w:r>
-      <w:proofErr w:type="spellEnd"/>
-      <w:r>
-        <w:t xml:space="preserve"> de red y sincronizando los cambios con el Backend (.NET) automáticamente al restablecerse la conexión.</w:t>
+        <w:t>escritor continuar redactando en caso de micro-cortes de red y sincronizando los cambios con el Backend (.NET) automáticamente al restablecerse la conexión.</w:t>
       </w:r>
     </w:p>
     <w:p>
@@ -22658,23 +21998,7 @@
         <w:t>"Última Escritura Gana" (Last Write Wins - LWW)</w:t>
       </w:r>
       <w:r>
-        <w:t>. Se utilizará la marca de tiempo del servidor (Server-</w:t>
-      </w:r>
-      <w:proofErr w:type="spellStart"/>
-      <w:r>
-        <w:t>Side</w:t>
-      </w:r>
-      <w:proofErr w:type="spellEnd"/>
-      <w:r>
-        <w:t xml:space="preserve"> </w:t>
-      </w:r>
-      <w:proofErr w:type="spellStart"/>
-      <w:r>
-        <w:t>Timestamp</w:t>
-      </w:r>
-      <w:proofErr w:type="spellEnd"/>
-      <w:r>
-        <w:t>) al momento de recibir la petición para determinar qué versión del manuscrito prevalece, descartando versiones anteriores que lleguen con retraso.</w:t>
+        <w:t>. Se utilizará la marca de tiempo del servidor (Server-Side Timestamp) al momento de recibir la petición para determinar qué versión del manuscrito prevalece, descartando versiones anteriores que lleguen con retraso.</w:t>
       </w:r>
     </w:p>
     <w:p>
@@ -22735,23 +22059,7 @@
           <w:b/>
           <w:bCs/>
         </w:rPr>
-        <w:t xml:space="preserve">RNF-01: </w:t>
-      </w:r>
-      <w:proofErr w:type="spellStart"/>
-      <w:r>
-        <w:rPr>
-          <w:b/>
-          <w:bCs/>
-        </w:rPr>
-        <w:t>Contenerización</w:t>
-      </w:r>
-      <w:proofErr w:type="spellEnd"/>
-      <w:r>
-        <w:rPr>
-          <w:b/>
-          <w:bCs/>
-        </w:rPr>
-        <w:t xml:space="preserve"> Total.</w:t>
+        <w:t>RNF-01: Contenerización Total.</w:t>
       </w:r>
       <w:r>
         <w:t xml:space="preserve"> Todos los componentes del servidor (Backend .NET, Backend Node.js, SQL Server, MongoDB, Neo4j) deben estar encapsulados en contenedores </w:t>
@@ -22764,15 +22072,7 @@
         <w:t>Docker</w:t>
       </w:r>
       <w:r>
-        <w:t xml:space="preserve">. El despliegue completo de la infraestructura debe ser ejecutable mediante un único comando de orquestación (ej. </w:t>
-      </w:r>
-      <w:proofErr w:type="spellStart"/>
-      <w:r>
-        <w:t>docker-compose</w:t>
-      </w:r>
-      <w:proofErr w:type="spellEnd"/>
-      <w:r>
-        <w:t xml:space="preserve"> up).</w:t>
+        <w:t>. El despliegue completo de la infraestructura debe ser ejecutable mediante un único comando de orquestación (ej. docker-compose up).</w:t>
       </w:r>
     </w:p>
     <w:p>
@@ -22788,66 +22088,10 @@
           <w:b/>
           <w:bCs/>
         </w:rPr>
-        <w:t>RNF-02: Versionado de Imágenes (</w:t>
-      </w:r>
-      <w:proofErr w:type="spellStart"/>
-      <w:r>
-        <w:rPr>
-          <w:b/>
-          <w:bCs/>
-        </w:rPr>
-        <w:t>Rollback</w:t>
-      </w:r>
-      <w:proofErr w:type="spellEnd"/>
-      <w:r>
-        <w:rPr>
-          <w:b/>
-          <w:bCs/>
-        </w:rPr>
-        <w:t xml:space="preserve"> </w:t>
-      </w:r>
-      <w:proofErr w:type="spellStart"/>
-      <w:r>
-        <w:rPr>
-          <w:b/>
-          <w:bCs/>
-        </w:rPr>
-        <w:t>Capability</w:t>
-      </w:r>
-      <w:proofErr w:type="spellEnd"/>
-      <w:r>
-        <w:rPr>
-          <w:b/>
-          <w:bCs/>
-        </w:rPr>
-        <w:t>).</w:t>
-      </w:r>
-      <w:r>
-        <w:t xml:space="preserve"> El sistema de despliegue debe utilizar etiquetado semántico de imágenes (ej. layla-</w:t>
-      </w:r>
-      <w:proofErr w:type="gramStart"/>
-      <w:r>
-        <w:t>api:v</w:t>
-      </w:r>
-      <w:proofErr w:type="gramEnd"/>
-      <w:r>
-        <w:t>1.0, layla-</w:t>
-      </w:r>
-      <w:proofErr w:type="gramStart"/>
-      <w:r>
-        <w:t>api:v</w:t>
-      </w:r>
-      <w:proofErr w:type="gramEnd"/>
-      <w:r>
-        <w:t>1.1). El sistema debe permitir volver a una versión anterior estable (</w:t>
-      </w:r>
-      <w:proofErr w:type="spellStart"/>
-      <w:r>
-        <w:t>rollback</w:t>
-      </w:r>
-      <w:proofErr w:type="spellEnd"/>
-      <w:r>
-        <w:t>) en menos de 5 minutos simplemente cambiando la etiqueta de la imagen en el archivo de orquestación.</w:t>
+        <w:t>RNF-02: Versionado de Imágenes (Rollback Capability).</w:t>
+      </w:r>
+      <w:r>
+        <w:t xml:space="preserve"> El sistema de despliegue debe utilizar etiquetado semántico de imágenes (ej. layla-api:v1.0, layla-api:v1.1). El sistema debe permitir volver a una versión anterior estable (rollback) en menos de 5 minutos simplemente cambiando la etiqueta de la imagen en el archivo de orquestación.</w:t>
       </w:r>
     </w:p>
     <w:p>
@@ -22867,15 +22111,7 @@
         <w:t>RNF-03: Separación de Configuración.</w:t>
       </w:r>
       <w:r>
-        <w:t xml:space="preserve"> Las configuraciones sensibles (cadenas de conexión, claves JWT, puertos) no deben estar "</w:t>
-      </w:r>
-      <w:proofErr w:type="spellStart"/>
-      <w:r>
-        <w:t>hardcodeadas</w:t>
-      </w:r>
-      <w:proofErr w:type="spellEnd"/>
-      <w:r>
-        <w:t xml:space="preserve">" en el código ni en la imagen del contenedor, sino que deben inyectarse mediante </w:t>
+        <w:t xml:space="preserve"> Las configuraciones sensibles (cadenas de conexión, claves JWT, puertos) no deben estar "hardcodeadas" en el código ni en la imagen del contenedor, sino que deben inyectarse mediante </w:t>
       </w:r>
       <w:r>
         <w:rPr>
@@ -22885,23 +22121,7 @@
         <w:t>Variables de Entorno</w:t>
       </w:r>
       <w:r>
-        <w:t xml:space="preserve"> (.</w:t>
-      </w:r>
-      <w:proofErr w:type="spellStart"/>
-      <w:r>
-        <w:t>env</w:t>
-      </w:r>
-      <w:proofErr w:type="spellEnd"/>
-      <w:r>
-        <w:t xml:space="preserve">) en tiempo de ejecución. Esto permite actualizar configuraciones sin recompilar ni </w:t>
-      </w:r>
-      <w:proofErr w:type="spellStart"/>
-      <w:r>
-        <w:t>redestribuir</w:t>
-      </w:r>
-      <w:proofErr w:type="spellEnd"/>
-      <w:r>
-        <w:t xml:space="preserve"> el código.</w:t>
+        <w:t xml:space="preserve"> (.env) en tiempo de ejecución. Esto permite actualizar configuraciones sin recompilar ni redestribuir el código.</w:t>
       </w:r>
     </w:p>
     <w:p>
@@ -22930,15 +22150,7 @@
         <w:t>Volúmenes de Docker</w:t>
       </w:r>
       <w:r>
-        <w:t xml:space="preserve"> (Docker </w:t>
-      </w:r>
-      <w:proofErr w:type="spellStart"/>
-      <w:r>
-        <w:t>Volumes</w:t>
-      </w:r>
-      <w:proofErr w:type="spellEnd"/>
-      <w:r>
-        <w:t>) independientes de los contenedores de aplicación. Esto garantiza que una actualización o destrucción del contenedor de la base de datos no resulte en pérdida de información.</w:t>
+        <w:t xml:space="preserve"> (Docker Volumes) independientes de los contenedores de aplicación. Esto garantiza que una actualización o destrucción del contenedor de la base de datos no resulte en pérdida de información.</w:t>
       </w:r>
     </w:p>
     <w:p>
@@ -22973,15 +22185,7 @@
         <w:t>RNF-05: Tiempo de Recuperación (RTO).</w:t>
       </w:r>
       <w:r>
-        <w:t xml:space="preserve"> En caso de fallo crítico tras una actualización, el tiempo para restaurar el servicio a la versión anterior (</w:t>
-      </w:r>
-      <w:proofErr w:type="spellStart"/>
-      <w:r>
-        <w:t>Rollback</w:t>
-      </w:r>
-      <w:proofErr w:type="spellEnd"/>
-      <w:r>
-        <w:t xml:space="preserve">) no debe exceder los </w:t>
+        <w:t xml:space="preserve"> En caso de fallo crítico tras una actualización, el tiempo para restaurar el servicio a la versión anterior (Rollback) no debe exceder los </w:t>
       </w:r>
       <w:r>
         <w:rPr>
@@ -23007,23 +22211,7 @@
           <w:b/>
           <w:bCs/>
         </w:rPr>
-        <w:t xml:space="preserve">RNF-06: Automatización de </w:t>
-      </w:r>
-      <w:proofErr w:type="spellStart"/>
-      <w:r>
-        <w:rPr>
-          <w:b/>
-          <w:bCs/>
-        </w:rPr>
-        <w:t>Build</w:t>
-      </w:r>
-      <w:proofErr w:type="spellEnd"/>
-      <w:r>
-        <w:rPr>
-          <w:b/>
-          <w:bCs/>
-        </w:rPr>
-        <w:t>.</w:t>
+        <w:t>RNF-06: Automatización de Build.</w:t>
       </w:r>
       <w:r>
         <w:t xml:space="preserve"> El proceso de compilación y creación de imágenes Docker debe estar automatizado mediante scripts o un pipeline de CI (Integración Continua), asegurando que el artefacto desplegable sea idéntico en desarrollo y producción.</w:t>
@@ -23042,34 +22230,10 @@
           <w:b/>
           <w:bCs/>
         </w:rPr>
-        <w:t>RNF-07: Hot-</w:t>
-      </w:r>
-      <w:proofErr w:type="spellStart"/>
-      <w:r>
-        <w:rPr>
-          <w:b/>
-          <w:bCs/>
-        </w:rPr>
-        <w:t>Swapping</w:t>
-      </w:r>
-      <w:proofErr w:type="spellEnd"/>
-      <w:r>
-        <w:rPr>
-          <w:b/>
-          <w:bCs/>
-        </w:rPr>
-        <w:t xml:space="preserve"> (Deseable).</w:t>
-      </w:r>
-      <w:r>
-        <w:t xml:space="preserve"> El sistema debe permitir la actualización de los servicios de backend con un tiempo de inactividad (</w:t>
-      </w:r>
-      <w:proofErr w:type="spellStart"/>
-      <w:r>
-        <w:t>downtime</w:t>
-      </w:r>
-      <w:proofErr w:type="spellEnd"/>
-      <w:r>
-        <w:t>) mínimo, preferiblemente menor a 1 minuto, mediante el reinicio rápido de contenedores ligeros (</w:t>
+        <w:t>RNF-07: Hot-Swapping (Deseable).</w:t>
+      </w:r>
+      <w:r>
+        <w:t xml:space="preserve"> El sistema debe permitir la actualización de los servicios de backend con un tiempo de inactividad (downtime) mínimo, preferiblemente menor a 1 minuto, mediante el reinicio rápido de contenedores ligeros (</w:t>
       </w:r>
       <w:r>
         <w:rPr>
@@ -23095,23 +22259,7 @@
           <w:b/>
           <w:bCs/>
         </w:rPr>
-        <w:t>Fiabilidad y Resiliencia (</w:t>
-      </w:r>
-      <w:proofErr w:type="spellStart"/>
-      <w:r>
-        <w:rPr>
-          <w:b/>
-          <w:bCs/>
-        </w:rPr>
-        <w:t>Reliability</w:t>
-      </w:r>
-      <w:proofErr w:type="spellEnd"/>
-      <w:r>
-        <w:rPr>
-          <w:b/>
-          <w:bCs/>
-        </w:rPr>
-        <w:t>)</w:t>
+        <w:t>Fiabilidad y Resiliencia (Reliability)</w:t>
       </w:r>
     </w:p>
     <w:p>
@@ -23140,15 +22288,7 @@
         <w:t>reconexión automática</w:t>
       </w:r>
       <w:r>
-        <w:t xml:space="preserve"> (</w:t>
-      </w:r>
-      <w:proofErr w:type="spellStart"/>
-      <w:r>
-        <w:t>Exponential</w:t>
-      </w:r>
-      <w:proofErr w:type="spellEnd"/>
-      <w:r>
-        <w:t xml:space="preserve"> Backoff) al socket sin cerrar la sesión del usuario. Si la reconexión falla tras 3 intentos, el sistema debe notificar al usuario y guardar el estado localmente para evitar pérdida de datos.</w:t>
+        <w:t xml:space="preserve"> (Exponential Backoff) al socket sin cerrar la sesión del usuario. Si la reconexión falla tras 3 intentos, el sistema debe notificar al usuario y guardar el estado localmente para evitar pérdida de datos.</w:t>
       </w:r>
     </w:p>
     <w:p>
@@ -23167,23 +22307,7 @@
         <w:t>RNF-09: Recuperación Automática de Servicios (Self-Healing).</w:t>
       </w:r>
       <w:r>
-        <w:t xml:space="preserve"> Si uno de los contenedores del backend (.NET o Node.js) falla o se cierra inesperadamente por una excepción no controlada, el orquestador (Docker) debe reiniciar el contenedor automáticamente mediante la política de reinicio (</w:t>
-      </w:r>
-      <w:proofErr w:type="spellStart"/>
-      <w:r>
-        <w:t>restart</w:t>
-      </w:r>
-      <w:proofErr w:type="spellEnd"/>
-      <w:r>
-        <w:t xml:space="preserve">: </w:t>
-      </w:r>
-      <w:proofErr w:type="spellStart"/>
-      <w:r>
-        <w:t>on-failure</w:t>
-      </w:r>
-      <w:proofErr w:type="spellEnd"/>
-      <w:r>
-        <w:t>) en menos de 10 segundos.</w:t>
+        <w:t xml:space="preserve"> Si uno de los contenedores del backend (.NET o Node.js) falla o se cierra inesperadamente por una excepción no controlada, el orquestador (Docker) debe reiniciar el contenedor automáticamente mediante la política de reinicio (restart: on-failure) en menos de 10 segundos.</w:t>
       </w:r>
     </w:p>
     <w:p>
@@ -23199,42 +22323,10 @@
           <w:b/>
           <w:bCs/>
         </w:rPr>
-        <w:t xml:space="preserve">RNF-10: Patrón </w:t>
-      </w:r>
-      <w:proofErr w:type="spellStart"/>
-      <w:r>
-        <w:rPr>
-          <w:b/>
-          <w:bCs/>
-        </w:rPr>
-        <w:t>Circuit</w:t>
-      </w:r>
-      <w:proofErr w:type="spellEnd"/>
-      <w:r>
-        <w:rPr>
-          <w:b/>
-          <w:bCs/>
-        </w:rPr>
-        <w:t xml:space="preserve"> Breaker (Base de Datos).</w:t>
-      </w:r>
-      <w:r>
-        <w:t xml:space="preserve"> El sistema debe implementar el patrón "Cortocircuito" (</w:t>
-      </w:r>
-      <w:proofErr w:type="spellStart"/>
-      <w:r>
-        <w:t>Circuit</w:t>
-      </w:r>
-      <w:proofErr w:type="spellEnd"/>
-      <w:r>
-        <w:t xml:space="preserve"> Breaker). Si la conexión con MongoDB o SQL Server falla repetidamente (</w:t>
-      </w:r>
-      <w:proofErr w:type="spellStart"/>
-      <w:r>
-        <w:t>timeout</w:t>
-      </w:r>
-      <w:proofErr w:type="spellEnd"/>
-      <w:r>
-        <w:t xml:space="preserve">), el backend debe dejar </w:t>
+        <w:t>RNF-10: Patrón Circuit Breaker (Base de Datos).</w:t>
+      </w:r>
+      <w:r>
+        <w:t xml:space="preserve"> El sistema debe implementar el patrón "Cortocircuito" (Circuit Breaker). Si la conexión con MongoDB o SQL Server falla repetidamente (timeout), el backend debe dejar </w:t>
       </w:r>
       <w:r>
         <w:lastRenderedPageBreak/>
@@ -24985,15 +24077,7 @@
         <w:t xml:space="preserve">Justificación Técnica: </w:t>
       </w:r>
       <w:r>
-        <w:t>Aprovecha el hardware nativo (micrófono/sensores) para el módulo de voz Push-</w:t>
-      </w:r>
-      <w:proofErr w:type="spellStart"/>
-      <w:r>
-        <w:t>to</w:t>
-      </w:r>
-      <w:proofErr w:type="spellEnd"/>
-      <w:r>
-        <w:t>-Talk y notificaciones.</w:t>
+        <w:t>Aprovecha el hardware nativo (micrófono/sensores) para el módulo de voz Push-to-Talk y notificaciones.</w:t>
       </w:r>
     </w:p>
     <w:p>
@@ -25469,23 +24553,7 @@
         <w:t>Heterogeneidad:</w:t>
       </w:r>
       <w:r>
-        <w:t xml:space="preserve"> Se logra la interoperabilidad total entre los clientes (Android y Web) y los servicios de backend (ASP.NET Core y Node.js) mediante el intercambio de mensajes en formato JSON estándar y el uso de </w:t>
-      </w:r>
-      <w:proofErr w:type="spellStart"/>
-      <w:r>
-        <w:t>APIs</w:t>
-      </w:r>
-      <w:proofErr w:type="spellEnd"/>
-      <w:r>
-        <w:t xml:space="preserve"> </w:t>
-      </w:r>
-      <w:proofErr w:type="spellStart"/>
-      <w:r>
-        <w:t>RESTful</w:t>
-      </w:r>
-      <w:proofErr w:type="spellEnd"/>
-      <w:r>
-        <w:t xml:space="preserve"> agnósticas a la plataforma. </w:t>
+        <w:t xml:space="preserve"> Se logra la interoperabilidad total entre los clientes (Android y Web) y los servicios de backend (ASP.NET Core y Node.js) mediante el intercambio de mensajes en formato JSON estándar y el uso de APIs RESTful agnósticas a la plataforma. </w:t>
       </w:r>
     </w:p>
     <w:p>
@@ -25518,15 +24586,7 @@
         <w:t>Resolución de Conflictos en Edición:</w:t>
       </w:r>
       <w:r>
-        <w:t xml:space="preserve"> Dado que la implementación de Transformación Operacional (OT) o Tipos de Datos Replicados Libres de Conflictos (</w:t>
-      </w:r>
-      <w:proofErr w:type="spellStart"/>
-      <w:r>
-        <w:t>CRDTs</w:t>
-      </w:r>
-      <w:proofErr w:type="spellEnd"/>
-      <w:r>
-        <w:t xml:space="preserve">) excede el alcance temporal de este proyecto académico, Layla adopta un enfoque pragmático de </w:t>
+        <w:t xml:space="preserve"> Dado que la implementación de Transformación Operacional (OT) o Tipos de Datos Replicados Libres de Conflictos (CRDTs) excede el alcance temporal de este proyecto académico, Layla adopta un enfoque pragmático de </w:t>
       </w:r>
       <w:r>
         <w:rPr>
@@ -25648,15 +24708,7 @@
         <w:t>Publicación (.NET):</w:t>
       </w:r>
       <w:r>
-        <w:t xml:space="preserve"> Cuando ocurre una acción crítica (ej. "Crear Personaje"), el Backend Core publica un mensaje en la cola </w:t>
-      </w:r>
-      <w:proofErr w:type="spellStart"/>
-      <w:r>
-        <w:t>worldbuilding_events</w:t>
-      </w:r>
-      <w:proofErr w:type="spellEnd"/>
-      <w:r>
-        <w:t>.</w:t>
+        <w:t xml:space="preserve"> Cuando ocurre una acción crítica (ej. "Crear Personaje"), el Backend Core publica un mensaje en la cola worldbuilding_events.</w:t>
       </w:r>
     </w:p>
     <w:p>
@@ -25934,175 +24986,103 @@
                 <w:b/>
                 <w:bCs/>
               </w:rPr>
-              <w:t xml:space="preserve">Consistencia Eventual &amp; </w:t>
-            </w:r>
-            <w:proofErr w:type="spellStart"/>
+              <w:t>Consistencia Eventual &amp; Soft Deletes.</w:t>
+            </w:r>
+            <w:r>
+              <w:t xml:space="preserve"> Se utiliza RabbitMQ para garantizar que el mensaje de borrado llegue eventualmente. Además, se implementa "Borrado Lógico" (IsDeleted=true) en lugar de físico, facilitando la recuperación y sincronización.</w:t>
+            </w:r>
+          </w:p>
+        </w:tc>
+      </w:tr>
+      <w:tr>
+        <w:tc>
+          <w:tcPr>
+            <w:cnfStyle w:val="001000000000" w:firstRow="0" w:lastRow="0" w:firstColumn="1" w:lastColumn="0" w:oddVBand="0" w:evenVBand="0" w:oddHBand="0" w:evenHBand="0" w:firstRowFirstColumn="0" w:firstRowLastColumn="0" w:lastRowFirstColumn="0" w:lastRowLastColumn="0"/>
+            <w:tcW w:w="721" w:type="dxa"/>
+            <w:hideMark/>
+          </w:tcPr>
+          <w:p>
+            <w:pPr>
+              <w:spacing w:after="160" w:line="278" w:lineRule="auto"/>
+            </w:pPr>
+            <w:r>
+              <w:t>R-02</w:t>
+            </w:r>
+          </w:p>
+        </w:tc>
+        <w:tc>
+          <w:tcPr>
+            <w:tcW w:w="2567" w:type="dxa"/>
+            <w:hideMark/>
+          </w:tcPr>
+          <w:p>
+            <w:pPr>
+              <w:spacing w:after="160" w:line="278" w:lineRule="auto"/>
+              <w:cnfStyle w:val="000000000000" w:firstRow="0" w:lastRow="0" w:firstColumn="0" w:lastColumn="0" w:oddVBand="0" w:evenVBand="0" w:oddHBand="0" w:evenHBand="0" w:firstRowFirstColumn="0" w:firstRowLastColumn="0" w:lastRowFirstColumn="0" w:lastRowLastColumn="0"/>
+            </w:pPr>
             <w:r>
               <w:rPr>
                 <w:b/>
                 <w:bCs/>
               </w:rPr>
-              <w:t>Soft</w:t>
-            </w:r>
-            <w:proofErr w:type="spellEnd"/>
+              <w:t>Latencia en Voz (Jitter).</w:t>
+            </w:r>
+            <w:r>
+              <w:t xml:space="preserve"> La red puede saturarse, causando que el audio llegue </w:t>
+            </w:r>
+            <w:r>
+              <w:lastRenderedPageBreak/>
+              <w:t>entrecortado o con mucho retraso, afectando la experiencia de colaboración.</w:t>
+            </w:r>
+          </w:p>
+        </w:tc>
+        <w:tc>
+          <w:tcPr>
+            <w:tcW w:w="1165" w:type="dxa"/>
+            <w:hideMark/>
+          </w:tcPr>
+          <w:p>
+            <w:pPr>
+              <w:spacing w:after="160" w:line="278" w:lineRule="auto"/>
+              <w:cnfStyle w:val="000000000000" w:firstRow="0" w:lastRow="0" w:firstColumn="0" w:lastColumn="0" w:oddVBand="0" w:evenVBand="0" w:oddHBand="0" w:evenHBand="0" w:firstRowFirstColumn="0" w:firstRowLastColumn="0" w:lastRowFirstColumn="0" w:lastRowLastColumn="0"/>
+            </w:pPr>
+            <w:r>
+              <w:lastRenderedPageBreak/>
+              <w:t>Medio</w:t>
+            </w:r>
+          </w:p>
+        </w:tc>
+        <w:tc>
+          <w:tcPr>
+            <w:tcW w:w="1609" w:type="dxa"/>
+            <w:hideMark/>
+          </w:tcPr>
+          <w:p>
+            <w:pPr>
+              <w:spacing w:after="160" w:line="278" w:lineRule="auto"/>
+              <w:cnfStyle w:val="000000000000" w:firstRow="0" w:lastRow="0" w:firstColumn="0" w:lastColumn="0" w:oddVBand="0" w:evenVBand="0" w:oddHBand="0" w:evenHBand="0" w:firstRowFirstColumn="0" w:firstRowLastColumn="0" w:lastRowFirstColumn="0" w:lastRowLastColumn="0"/>
+            </w:pPr>
+            <w:r>
+              <w:t>Alta</w:t>
+            </w:r>
+          </w:p>
+        </w:tc>
+        <w:tc>
+          <w:tcPr>
+            <w:tcW w:w="2432" w:type="dxa"/>
+            <w:hideMark/>
+          </w:tcPr>
+          <w:p>
+            <w:pPr>
+              <w:spacing w:after="160" w:line="278" w:lineRule="auto"/>
+              <w:cnfStyle w:val="000000000000" w:firstRow="0" w:lastRow="0" w:firstColumn="0" w:lastColumn="0" w:oddVBand="0" w:evenVBand="0" w:oddHBand="0" w:evenHBand="0" w:firstRowFirstColumn="0" w:firstRowLastColumn="0" w:lastRowFirstColumn="0" w:lastRowLastColumn="0"/>
+            </w:pPr>
             <w:r>
               <w:rPr>
                 <w:b/>
                 <w:bCs/>
               </w:rPr>
-              <w:t xml:space="preserve"> </w:t>
-            </w:r>
-            <w:proofErr w:type="spellStart"/>
-            <w:r>
-              <w:rPr>
-                <w:b/>
-                <w:bCs/>
-              </w:rPr>
-              <w:t>Deletes</w:t>
-            </w:r>
-            <w:proofErr w:type="spellEnd"/>
-            <w:r>
-              <w:rPr>
-                <w:b/>
-                <w:bCs/>
-              </w:rPr>
-              <w:t>.</w:t>
-            </w:r>
-            <w:r>
-              <w:t xml:space="preserve"> Se utiliza RabbitMQ para garantizar que el mensaje de borrado llegue eventualmente. Además, se implementa "Borrado Lógico" (</w:t>
-            </w:r>
-            <w:proofErr w:type="spellStart"/>
-            <w:r>
-              <w:t>IsDeleted</w:t>
-            </w:r>
-            <w:proofErr w:type="spellEnd"/>
-            <w:r>
-              <w:t>=true) en lugar de físico, facilitando la recuperación y sincronización.</w:t>
-            </w:r>
-          </w:p>
-        </w:tc>
-      </w:tr>
-      <w:tr>
-        <w:tc>
-          <w:tcPr>
-            <w:cnfStyle w:val="001000000000" w:firstRow="0" w:lastRow="0" w:firstColumn="1" w:lastColumn="0" w:oddVBand="0" w:evenVBand="0" w:oddHBand="0" w:evenHBand="0" w:firstRowFirstColumn="0" w:firstRowLastColumn="0" w:lastRowFirstColumn="0" w:lastRowLastColumn="0"/>
-            <w:tcW w:w="721" w:type="dxa"/>
-            <w:hideMark/>
-          </w:tcPr>
-          <w:p>
-            <w:pPr>
-              <w:spacing w:after="160" w:line="278" w:lineRule="auto"/>
-            </w:pPr>
-            <w:r>
-              <w:t>R-02</w:t>
-            </w:r>
-          </w:p>
-        </w:tc>
-        <w:tc>
-          <w:tcPr>
-            <w:tcW w:w="2567" w:type="dxa"/>
-            <w:hideMark/>
-          </w:tcPr>
-          <w:p>
-            <w:pPr>
-              <w:spacing w:after="160" w:line="278" w:lineRule="auto"/>
-              <w:cnfStyle w:val="000000000000" w:firstRow="0" w:lastRow="0" w:firstColumn="0" w:lastColumn="0" w:oddVBand="0" w:evenVBand="0" w:oddHBand="0" w:evenHBand="0" w:firstRowFirstColumn="0" w:firstRowLastColumn="0" w:lastRowFirstColumn="0" w:lastRowLastColumn="0"/>
-            </w:pPr>
-            <w:r>
-              <w:rPr>
-                <w:b/>
-                <w:bCs/>
-              </w:rPr>
-              <w:t>Latencia en Voz (</w:t>
-            </w:r>
-            <w:proofErr w:type="spellStart"/>
-            <w:r>
-              <w:rPr>
-                <w:b/>
-                <w:bCs/>
-              </w:rPr>
-              <w:t>Jitter</w:t>
-            </w:r>
-            <w:proofErr w:type="spellEnd"/>
-            <w:r>
-              <w:rPr>
-                <w:b/>
-                <w:bCs/>
-              </w:rPr>
-              <w:t>).</w:t>
-            </w:r>
-            <w:r>
-              <w:t xml:space="preserve"> La red puede saturarse, causando que el audio llegue </w:t>
-            </w:r>
-            <w:r>
-              <w:lastRenderedPageBreak/>
-              <w:t>entrecortado o con mucho retraso, afectando la experiencia de colaboración.</w:t>
-            </w:r>
-          </w:p>
-        </w:tc>
-        <w:tc>
-          <w:tcPr>
-            <w:tcW w:w="1165" w:type="dxa"/>
-            <w:hideMark/>
-          </w:tcPr>
-          <w:p>
-            <w:pPr>
-              <w:spacing w:after="160" w:line="278" w:lineRule="auto"/>
-              <w:cnfStyle w:val="000000000000" w:firstRow="0" w:lastRow="0" w:firstColumn="0" w:lastColumn="0" w:oddVBand="0" w:evenVBand="0" w:oddHBand="0" w:evenHBand="0" w:firstRowFirstColumn="0" w:firstRowLastColumn="0" w:lastRowFirstColumn="0" w:lastRowLastColumn="0"/>
-            </w:pPr>
-            <w:r>
-              <w:lastRenderedPageBreak/>
-              <w:t>Medio</w:t>
-            </w:r>
-          </w:p>
-        </w:tc>
-        <w:tc>
-          <w:tcPr>
-            <w:tcW w:w="1609" w:type="dxa"/>
-            <w:hideMark/>
-          </w:tcPr>
-          <w:p>
-            <w:pPr>
-              <w:spacing w:after="160" w:line="278" w:lineRule="auto"/>
-              <w:cnfStyle w:val="000000000000" w:firstRow="0" w:lastRow="0" w:firstColumn="0" w:lastColumn="0" w:oddVBand="0" w:evenVBand="0" w:oddHBand="0" w:evenHBand="0" w:firstRowFirstColumn="0" w:firstRowLastColumn="0" w:lastRowFirstColumn="0" w:lastRowLastColumn="0"/>
-            </w:pPr>
-            <w:r>
-              <w:t>Alta</w:t>
-            </w:r>
-          </w:p>
-        </w:tc>
-        <w:tc>
-          <w:tcPr>
-            <w:tcW w:w="2432" w:type="dxa"/>
-            <w:hideMark/>
-          </w:tcPr>
-          <w:p>
-            <w:pPr>
-              <w:spacing w:after="160" w:line="278" w:lineRule="auto"/>
-              <w:cnfStyle w:val="000000000000" w:firstRow="0" w:lastRow="0" w:firstColumn="0" w:lastColumn="0" w:oddVBand="0" w:evenVBand="0" w:oddHBand="0" w:evenHBand="0" w:firstRowFirstColumn="0" w:firstRowLastColumn="0" w:lastRowFirstColumn="0" w:lastRowLastColumn="0"/>
-            </w:pPr>
-            <w:r>
-              <w:rPr>
-                <w:b/>
-                <w:bCs/>
-              </w:rPr>
-              <w:t>Modelo Push-</w:t>
-            </w:r>
-            <w:proofErr w:type="spellStart"/>
-            <w:r>
-              <w:rPr>
-                <w:b/>
-                <w:bCs/>
-              </w:rPr>
-              <w:t>to</w:t>
-            </w:r>
-            <w:proofErr w:type="spellEnd"/>
-            <w:r>
-              <w:rPr>
-                <w:b/>
-                <w:bCs/>
-              </w:rPr>
-              <w:t>-Talk.</w:t>
+              <w:t>Modelo Push-to-Talk.</w:t>
             </w:r>
             <w:r>
               <w:t xml:space="preserve"> Se elimina el eco y se reduce el ancho de banda </w:t>
@@ -26152,15 +25132,7 @@
               <w:t>Agotamiento de Recursos en Desarrollo.</w:t>
             </w:r>
             <w:r>
-              <w:t xml:space="preserve"> Ejecutar 6 contenedores (SQL, Mongo, Neo4j, RabbitMQ, </w:t>
-            </w:r>
-            <w:proofErr w:type="spellStart"/>
-            <w:r>
-              <w:t>Backends</w:t>
-            </w:r>
-            <w:proofErr w:type="spellEnd"/>
-            <w:r>
-              <w:t>) puede saturar la memoria RAM del entorno local.</w:t>
+              <w:t xml:space="preserve"> Ejecutar 6 contenedores (SQL, Mongo, Neo4j, RabbitMQ, Backends) puede saturar la memoria RAM del entorno local.</w:t>
             </w:r>
           </w:p>
         </w:tc>
@@ -26212,23 +25184,7 @@
               <w:t>Límites de Contenedores.</w:t>
             </w:r>
             <w:r>
-              <w:t xml:space="preserve"> Configuración estricta de </w:t>
-            </w:r>
-            <w:proofErr w:type="spellStart"/>
-            <w:r>
-              <w:t>mem_limit</w:t>
-            </w:r>
-            <w:proofErr w:type="spellEnd"/>
-            <w:r>
-              <w:t xml:space="preserve"> en Docker </w:t>
-            </w:r>
-            <w:proofErr w:type="spellStart"/>
-            <w:r>
-              <w:t>Compose</w:t>
-            </w:r>
-            <w:proofErr w:type="spellEnd"/>
-            <w:r>
-              <w:t xml:space="preserve"> (ej. SQL Server limitado a 1GB) y uso de imágenes base Alpine o Slim para reducir la huella de memoria.</w:t>
+              <w:t xml:space="preserve"> Configuración estricta de mem_limit en Docker Compose (ej. SQL Server limitado a 1GB) y uso de imágenes base Alpine o Slim para reducir la huella de memoria.</w:t>
             </w:r>
           </w:p>
         </w:tc>
@@ -26319,31 +25275,7 @@
               <w:t>Políticas de Auto-Recuperación.</w:t>
             </w:r>
             <w:r>
-              <w:t xml:space="preserve"> Implementación de </w:t>
-            </w:r>
-            <w:proofErr w:type="spellStart"/>
-            <w:r>
-              <w:t>restart</w:t>
-            </w:r>
-            <w:proofErr w:type="spellEnd"/>
-            <w:r>
-              <w:t xml:space="preserve">: </w:t>
-            </w:r>
-            <w:proofErr w:type="spellStart"/>
-            <w:r>
-              <w:t>unless-stopped</w:t>
-            </w:r>
-            <w:proofErr w:type="spellEnd"/>
-            <w:r>
-              <w:t xml:space="preserve"> en Docker para el reinicio automático del servicio y Health </w:t>
-            </w:r>
-            <w:proofErr w:type="spellStart"/>
-            <w:r>
-              <w:t>Checks</w:t>
-            </w:r>
-            <w:proofErr w:type="spellEnd"/>
-            <w:r>
-              <w:t xml:space="preserve"> que previenen el enrutamiento de tráfico a contenedores no saludables.</w:t>
+              <w:t xml:space="preserve"> Implementación de restart: unless-stopped en Docker para el reinicio automático del servicio y Health Checks que previenen el enrutamiento de tráfico a contenedores no saludables.</w:t>
             </w:r>
           </w:p>
         </w:tc>
@@ -26442,15 +25374,7 @@
               <w:t>Diseño de API Abierta.</w:t>
             </w:r>
             <w:r>
-              <w:t xml:space="preserve"> Se mitiga mediante una API </w:t>
-            </w:r>
-            <w:proofErr w:type="spellStart"/>
-            <w:r>
-              <w:t>RESTful</w:t>
-            </w:r>
-            <w:proofErr w:type="spellEnd"/>
-            <w:r>
-              <w:t xml:space="preserve"> estandarizada que </w:t>
+              <w:t xml:space="preserve"> Se mitiga mediante una API RESTful estandarizada que </w:t>
             </w:r>
             <w:r>
               <w:lastRenderedPageBreak/>
@@ -26484,114 +25408,65 @@
                 <w:bCs/>
               </w:rPr>
             </w:pPr>
-            <w:proofErr w:type="spellStart"/>
             <w:r>
               <w:rPr>
                 <w:b/>
                 <w:bCs/>
               </w:rPr>
-              <w:t>Sobrescritura</w:t>
-            </w:r>
-            <w:proofErr w:type="spellEnd"/>
-            <w:r>
+              <w:t xml:space="preserve">Sobrescritura de Datos (Race Condition). </w:t>
+            </w:r>
+            <w:r>
+              <w:t>Si dos editores modifican el mismo párrafo simultáneamente, los cambios de uno podrían perderse al aplicar Last Write Wins.</w:t>
+            </w:r>
+          </w:p>
+        </w:tc>
+        <w:tc>
+          <w:tcPr>
+            <w:tcW w:w="1165" w:type="dxa"/>
+          </w:tcPr>
+          <w:p>
+            <w:pPr>
+              <w:cnfStyle w:val="000000000000" w:firstRow="0" w:lastRow="0" w:firstColumn="0" w:lastColumn="0" w:oddVBand="0" w:evenVBand="0" w:oddHBand="0" w:evenHBand="0" w:firstRowFirstColumn="0" w:firstRowLastColumn="0" w:lastRowFirstColumn="0" w:lastRowLastColumn="0"/>
+            </w:pPr>
+            <w:r>
+              <w:t>Medio</w:t>
+            </w:r>
+          </w:p>
+        </w:tc>
+        <w:tc>
+          <w:tcPr>
+            <w:tcW w:w="1609" w:type="dxa"/>
+          </w:tcPr>
+          <w:p>
+            <w:pPr>
+              <w:cnfStyle w:val="000000000000" w:firstRow="0" w:lastRow="0" w:firstColumn="0" w:lastColumn="0" w:oddVBand="0" w:evenVBand="0" w:oddHBand="0" w:evenHBand="0" w:firstRowFirstColumn="0" w:firstRowLastColumn="0" w:lastRowFirstColumn="0" w:lastRowLastColumn="0"/>
+            </w:pPr>
+            <w:r>
+              <w:t>Baja</w:t>
+            </w:r>
+          </w:p>
+        </w:tc>
+        <w:tc>
+          <w:tcPr>
+            <w:tcW w:w="2432" w:type="dxa"/>
+          </w:tcPr>
+          <w:p>
+            <w:pPr>
+              <w:cnfStyle w:val="000000000000" w:firstRow="0" w:lastRow="0" w:firstColumn="0" w:lastColumn="0" w:oddVBand="0" w:evenVBand="0" w:oddHBand="0" w:evenHBand="0" w:firstRowFirstColumn="0" w:firstRowLastColumn="0" w:lastRowFirstColumn="0" w:lastRowLastColumn="0"/>
               <w:rPr>
                 <w:b/>
                 <w:bCs/>
               </w:rPr>
-              <w:t xml:space="preserve"> de Datos (</w:t>
-            </w:r>
-            <w:proofErr w:type="spellStart"/>
+            </w:pPr>
             <w:r>
               <w:rPr>
                 <w:b/>
                 <w:bCs/>
               </w:rPr>
-              <w:t>Race</w:t>
-            </w:r>
-            <w:proofErr w:type="spellEnd"/>
-            <w:r>
-              <w:rPr>
-                <w:b/>
-                <w:bCs/>
-              </w:rPr>
-              <w:t xml:space="preserve"> </w:t>
-            </w:r>
-            <w:proofErr w:type="spellStart"/>
-            <w:r>
-              <w:rPr>
-                <w:b/>
-                <w:bCs/>
-              </w:rPr>
-              <w:t>Condition</w:t>
-            </w:r>
-            <w:proofErr w:type="spellEnd"/>
-            <w:r>
-              <w:rPr>
-                <w:b/>
-                <w:bCs/>
-              </w:rPr>
-              <w:t xml:space="preserve">). </w:t>
-            </w:r>
-            <w:r>
-              <w:t>Si dos editores modifican el mismo párrafo simultáneamente, los cambios de uno podrían perderse al aplicar Last Write Wins.</w:t>
-            </w:r>
-          </w:p>
-        </w:tc>
-        <w:tc>
-          <w:tcPr>
-            <w:tcW w:w="1165" w:type="dxa"/>
-          </w:tcPr>
-          <w:p>
-            <w:pPr>
-              <w:cnfStyle w:val="000000000000" w:firstRow="0" w:lastRow="0" w:firstColumn="0" w:lastColumn="0" w:oddVBand="0" w:evenVBand="0" w:oddHBand="0" w:evenHBand="0" w:firstRowFirstColumn="0" w:firstRowLastColumn="0" w:lastRowFirstColumn="0" w:lastRowLastColumn="0"/>
-            </w:pPr>
-            <w:r>
-              <w:t>Medio</w:t>
-            </w:r>
-          </w:p>
-        </w:tc>
-        <w:tc>
-          <w:tcPr>
-            <w:tcW w:w="1609" w:type="dxa"/>
-          </w:tcPr>
-          <w:p>
-            <w:pPr>
-              <w:cnfStyle w:val="000000000000" w:firstRow="0" w:lastRow="0" w:firstColumn="0" w:lastColumn="0" w:oddVBand="0" w:evenVBand="0" w:oddHBand="0" w:evenHBand="0" w:firstRowFirstColumn="0" w:firstRowLastColumn="0" w:lastRowFirstColumn="0" w:lastRowLastColumn="0"/>
-            </w:pPr>
-            <w:r>
-              <w:t>Baja</w:t>
-            </w:r>
-          </w:p>
-        </w:tc>
-        <w:tc>
-          <w:tcPr>
-            <w:tcW w:w="2432" w:type="dxa"/>
-          </w:tcPr>
-          <w:p>
-            <w:pPr>
-              <w:cnfStyle w:val="000000000000" w:firstRow="0" w:lastRow="0" w:firstColumn="0" w:lastColumn="0" w:oddVBand="0" w:evenVBand="0" w:oddHBand="0" w:evenHBand="0" w:firstRowFirstColumn="0" w:firstRowLastColumn="0" w:lastRowFirstColumn="0" w:lastRowLastColumn="0"/>
-              <w:rPr>
-                <w:b/>
-                <w:bCs/>
-              </w:rPr>
-            </w:pPr>
-            <w:r>
-              <w:rPr>
-                <w:b/>
-                <w:bCs/>
-              </w:rPr>
               <w:t xml:space="preserve">Bloqueo Optimista y LWW. </w:t>
             </w:r>
             <w:r>
-              <w:t xml:space="preserve">El sistema favorece la simplicidad del modelo LWW. Para mitigar pérdidas críticas, el cliente WPF guarda un historial de versiones local (Local </w:t>
-            </w:r>
-            <w:proofErr w:type="spellStart"/>
-            <w:r>
-              <w:t>History</w:t>
-            </w:r>
-            <w:proofErr w:type="spellEnd"/>
-            <w:r>
-              <w:t>) que permite al usuario recuperar texto sobrescrito manualmente si detecta una inconsistencia.</w:t>
+              <w:t>El sistema favorece la simplicidad del modelo LWW. Para mitigar pérdidas críticas, el cliente WPF guarda un historial de versiones local (Local History) que permite al usuario recuperar texto sobrescrito manualmente si detecta una inconsistencia.</w:t>
             </w:r>
           </w:p>
         </w:tc>
@@ -26626,23 +25501,7 @@
         <w:t>A. Estrategia ante la Inconsistencia (R-01)</w:t>
       </w:r>
       <w:r>
-        <w:t xml:space="preserve"> Dado que no es viable implementar transacciones distribuidas (Two-</w:t>
-      </w:r>
-      <w:proofErr w:type="spellStart"/>
-      <w:r>
-        <w:t>Phase</w:t>
-      </w:r>
-      <w:proofErr w:type="spellEnd"/>
-      <w:r>
-        <w:t xml:space="preserve"> </w:t>
-      </w:r>
-      <w:proofErr w:type="spellStart"/>
-      <w:r>
-        <w:t>Commit</w:t>
-      </w:r>
-      <w:proofErr w:type="spellEnd"/>
-      <w:r>
-        <w:t xml:space="preserve">) por su impacto en el rendimiento, el sistema adopta un modelo de </w:t>
+        <w:t xml:space="preserve"> Dado que no es viable implementar transacciones distribuidas (Two-Phase Commit) por su impacto en el rendimiento, el sistema adopta un modelo de </w:t>
       </w:r>
       <w:r>
         <w:rPr>
@@ -27007,15 +25866,7 @@
               <w:t>Lenguaje Principal.</w:t>
             </w:r>
             <w:r>
-              <w:t xml:space="preserve"> Elegido por su robustez, tipado estático y rendimiento. Gestiona Auth, SQL Server y orquestación de </w:t>
-            </w:r>
-            <w:proofErr w:type="spellStart"/>
-            <w:r>
-              <w:t>SignalR</w:t>
-            </w:r>
-            <w:proofErr w:type="spellEnd"/>
-            <w:r>
-              <w:t>.</w:t>
+              <w:t xml:space="preserve"> Elegido por su robustez, tipado estático y rendimiento. Gestiona Auth, SQL Server y orquestación de SignalR.</w:t>
             </w:r>
           </w:p>
         </w:tc>
@@ -27539,21 +26390,12 @@
               <w:spacing w:after="160" w:line="278" w:lineRule="auto"/>
               <w:cnfStyle w:val="000000000000" w:firstRow="0" w:lastRow="0" w:firstColumn="0" w:lastColumn="0" w:oddVBand="0" w:evenVBand="0" w:oddHBand="0" w:evenHBand="0" w:firstRowFirstColumn="0" w:firstRowLastColumn="0" w:lastRowFirstColumn="0" w:lastRowLastColumn="0"/>
             </w:pPr>
-            <w:proofErr w:type="spellStart"/>
             <w:r>
               <w:rPr>
                 <w:b/>
                 <w:bCs/>
               </w:rPr>
-              <w:t>SignalR</w:t>
-            </w:r>
-            <w:proofErr w:type="spellEnd"/>
-            <w:r>
-              <w:rPr>
-                <w:b/>
-                <w:bCs/>
-              </w:rPr>
-              <w:t xml:space="preserve"> (WebSockets)</w:t>
+              <w:t>SignalR (WebSockets)</w:t>
             </w:r>
           </w:p>
         </w:tc>
@@ -27568,15 +26410,7 @@
               <w:cnfStyle w:val="000000000000" w:firstRow="0" w:lastRow="0" w:firstColumn="0" w:lastColumn="0" w:oddVBand="0" w:evenVBand="0" w:oddHBand="0" w:evenHBand="0" w:firstRowFirstColumn="0" w:firstRowLastColumn="0" w:lastRowFirstColumn="0" w:lastRowLastColumn="0"/>
             </w:pPr>
             <w:r>
-              <w:t>Abstracción sobre WebSockets para garantizar la reconexión automática y el manejo de grupos (</w:t>
-            </w:r>
-            <w:proofErr w:type="spellStart"/>
-            <w:r>
-              <w:t>Hubs</w:t>
-            </w:r>
-            <w:proofErr w:type="spellEnd"/>
-            <w:r>
-              <w:t>) de voz.</w:t>
+              <w:t>Abstracción sobre WebSockets para garantizar la reconexión automática y el manejo de grupos (Hubs) de voz.</w:t>
             </w:r>
           </w:p>
         </w:tc>
@@ -27629,32 +26463,15 @@
               <w:spacing w:after="160" w:line="278" w:lineRule="auto"/>
               <w:cnfStyle w:val="000000100000" w:firstRow="0" w:lastRow="0" w:firstColumn="0" w:lastColumn="0" w:oddVBand="0" w:evenVBand="0" w:oddHBand="1" w:evenHBand="0" w:firstRowFirstColumn="0" w:firstRowLastColumn="0" w:lastRowFirstColumn="0" w:lastRowLastColumn="0"/>
             </w:pPr>
-            <w:proofErr w:type="spellStart"/>
             <w:r>
               <w:rPr>
                 <w:b/>
                 <w:bCs/>
               </w:rPr>
-              <w:t>Contenerización</w:t>
-            </w:r>
-            <w:proofErr w:type="spellEnd"/>
-            <w:r>
-              <w:rPr>
-                <w:b/>
-                <w:bCs/>
-              </w:rPr>
-              <w:t>.</w:t>
-            </w:r>
-            <w:r>
-              <w:t xml:space="preserve"> Despliegue orquestado de ambos </w:t>
-            </w:r>
-            <w:proofErr w:type="spellStart"/>
-            <w:r>
-              <w:t>backends</w:t>
-            </w:r>
-            <w:proofErr w:type="spellEnd"/>
-            <w:r>
-              <w:t xml:space="preserve"> y las tres bases de datos en un entorno Linux optimizado.</w:t>
+              <w:t>Contenerización.</w:t>
+            </w:r>
+            <w:r>
+              <w:t xml:space="preserve"> Despliegue orquestado de ambos backends y las tres bases de datos en un entorno Linux optimizado.</w:t>
             </w:r>
           </w:p>
         </w:tc>
@@ -27734,35 +26551,7 @@
           <w:rPr>
             <w:rStyle w:val="Hipervnculo"/>
           </w:rPr>
-          <w:t xml:space="preserve">C# </w:t>
-        </w:r>
-        <w:proofErr w:type="spellStart"/>
-        <w:r>
-          <w:rPr>
-            <w:rStyle w:val="Hipervnculo"/>
-          </w:rPr>
-          <w:t>Coding</w:t>
-        </w:r>
-        <w:proofErr w:type="spellEnd"/>
-        <w:r>
-          <w:rPr>
-            <w:rStyle w:val="Hipervnculo"/>
-          </w:rPr>
-          <w:t xml:space="preserve"> </w:t>
-        </w:r>
-        <w:proofErr w:type="spellStart"/>
-        <w:r>
-          <w:rPr>
-            <w:rStyle w:val="Hipervnculo"/>
-          </w:rPr>
-          <w:t>Conventions</w:t>
-        </w:r>
-        <w:proofErr w:type="spellEnd"/>
-        <w:r>
-          <w:rPr>
-            <w:rStyle w:val="Hipervnculo"/>
-          </w:rPr>
-          <w:t xml:space="preserve"> (Microsoft)</w:t>
+          <w:t>C# Coding Conventions (Microsoft)</w:t>
         </w:r>
       </w:hyperlink>
       <w:r>
@@ -27773,30 +26562,8 @@
           <w:rPr>
             <w:rStyle w:val="Hipervnculo"/>
           </w:rPr>
-          <w:t xml:space="preserve">Framework </w:t>
+          <w:t>Framework Design Guidelines</w:t>
         </w:r>
-        <w:proofErr w:type="spellStart"/>
-        <w:r>
-          <w:rPr>
-            <w:rStyle w:val="Hipervnculo"/>
-          </w:rPr>
-          <w:t>Design</w:t>
-        </w:r>
-        <w:proofErr w:type="spellEnd"/>
-        <w:r>
-          <w:rPr>
-            <w:rStyle w:val="Hipervnculo"/>
-          </w:rPr>
-          <w:t xml:space="preserve"> </w:t>
-        </w:r>
-        <w:proofErr w:type="spellStart"/>
-        <w:r>
-          <w:rPr>
-            <w:rStyle w:val="Hipervnculo"/>
-          </w:rPr>
-          <w:t>Guidelines</w:t>
-        </w:r>
-        <w:proofErr w:type="spellEnd"/>
       </w:hyperlink>
       <w:r>
         <w:t>.</w:t>
@@ -27888,7 +26655,6 @@
       <w:r>
         <w:t xml:space="preserve"> Esta guía proporciona un enfoque razonable y exhaustivo para escribir código JavaScript moderno (ES6 y superior). Impone reglas estrictas sobre la mutabilidad, el manejo de tipos y la sintaxis, lo que reduce drásticamente la probabilidad de errores en tiempo de ejecución y facilita la configuración de </w:t>
       </w:r>
-      <w:proofErr w:type="spellStart"/>
       <w:r>
         <w:rPr>
           <w:i/>
@@ -27896,17 +26662,8 @@
         </w:rPr>
         <w:t>linters</w:t>
       </w:r>
-      <w:proofErr w:type="spellEnd"/>
-      <w:r>
-        <w:t xml:space="preserve"> (como </w:t>
-      </w:r>
-      <w:proofErr w:type="spellStart"/>
-      <w:r>
-        <w:t>ESLint</w:t>
-      </w:r>
-      <w:proofErr w:type="spellEnd"/>
-      <w:r>
-        <w:t>).</w:t>
+      <w:r>
+        <w:t xml:space="preserve"> (como ESLint).</w:t>
       </w:r>
     </w:p>
     <w:p>
@@ -27951,49 +26708,7 @@
           <w:rPr>
             <w:rStyle w:val="Hipervnculo"/>
           </w:rPr>
-          <w:t xml:space="preserve">Kotlin </w:t>
-        </w:r>
-        <w:proofErr w:type="spellStart"/>
-        <w:r>
-          <w:rPr>
-            <w:rStyle w:val="Hipervnculo"/>
-          </w:rPr>
-          <w:t>Coding</w:t>
-        </w:r>
-        <w:proofErr w:type="spellEnd"/>
-        <w:r>
-          <w:rPr>
-            <w:rStyle w:val="Hipervnculo"/>
-          </w:rPr>
-          <w:t xml:space="preserve"> </w:t>
-        </w:r>
-        <w:proofErr w:type="spellStart"/>
-        <w:r>
-          <w:rPr>
-            <w:rStyle w:val="Hipervnculo"/>
-          </w:rPr>
-          <w:t>Conventions</w:t>
-        </w:r>
-        <w:proofErr w:type="spellEnd"/>
-        <w:r>
-          <w:rPr>
-            <w:rStyle w:val="Hipervnculo"/>
-          </w:rPr>
-          <w:t xml:space="preserve"> (</w:t>
-        </w:r>
-        <w:proofErr w:type="spellStart"/>
-        <w:r>
-          <w:rPr>
-            <w:rStyle w:val="Hipervnculo"/>
-          </w:rPr>
-          <w:t>JetBrains</w:t>
-        </w:r>
-        <w:proofErr w:type="spellEnd"/>
-        <w:r>
-          <w:rPr>
-            <w:rStyle w:val="Hipervnculo"/>
-          </w:rPr>
-          <w:t>)</w:t>
+          <w:t>Kotlin Coding Conventions (JetBrains)</w:t>
         </w:r>
       </w:hyperlink>
       <w:r>
@@ -28027,23 +26742,7 @@
         <w:t>Justificación:</w:t>
       </w:r>
       <w:r>
-        <w:t xml:space="preserve"> Seguir las convenciones oficiales de </w:t>
-      </w:r>
-      <w:proofErr w:type="spellStart"/>
-      <w:r>
-        <w:t>JetBrains</w:t>
-      </w:r>
-      <w:proofErr w:type="spellEnd"/>
-      <w:r>
-        <w:t xml:space="preserve"> garantiza el uso correcto de las características funcionales y orientadas a objetos de Kotlin. Además, asegura la compatibilidad con el formateador de código oficial (</w:t>
-      </w:r>
-      <w:proofErr w:type="spellStart"/>
-      <w:r>
-        <w:t>ktlint</w:t>
-      </w:r>
-      <w:proofErr w:type="spellEnd"/>
-      <w:r>
-        <w:t>) y maximiza la interoperabilidad fluida con bases de código existentes en Java.</w:t>
+        <w:t xml:space="preserve"> Seguir las convenciones oficiales de JetBrains garantiza el uso correcto de las características funcionales y orientadas a objetos de Kotlin. Además, asegura la compatibilidad con el formateador de código oficial (ktlint) y maximiza la interoperabilidad fluida con bases de código existentes en Java.</w:t>
       </w:r>
     </w:p>
     <w:p>
@@ -28114,7 +26813,6 @@
       <w:r>
         <w:t xml:space="preserve"> Se utiliza </w:t>
       </w:r>
-      <w:proofErr w:type="spellStart"/>
       <w:r>
         <w:rPr>
           <w:b/>
@@ -28122,11 +26820,9 @@
         </w:rPr>
         <w:t>xUnit</w:t>
       </w:r>
-      <w:proofErr w:type="spellEnd"/>
       <w:r>
         <w:t xml:space="preserve"> junto con </w:t>
       </w:r>
-      <w:proofErr w:type="spellStart"/>
       <w:r>
         <w:rPr>
           <w:b/>
@@ -28134,7 +26830,6 @@
         </w:rPr>
         <w:t>Moq</w:t>
       </w:r>
-      <w:proofErr w:type="spellEnd"/>
       <w:r>
         <w:t xml:space="preserve"> para validar los servicios de autenticación y lógica de negocio en el Backend A (ASP.NET Core).</w:t>
       </w:r>
@@ -28165,15 +26860,7 @@
         <w:t>Jest</w:t>
       </w:r>
       <w:r>
-        <w:t xml:space="preserve"> para verificar la correcta integración de los </w:t>
-      </w:r>
-      <w:proofErr w:type="spellStart"/>
-      <w:r>
-        <w:t>endpoints</w:t>
-      </w:r>
-      <w:proofErr w:type="spellEnd"/>
-      <w:r>
-        <w:t xml:space="preserve"> de la Wiki con MongoDB y Neo4j.</w:t>
+        <w:t xml:space="preserve"> para verificar la correcta integración de los endpoints de la Wiki con MongoDB y Neo4j.</w:t>
       </w:r>
     </w:p>
     <w:p>
@@ -28194,7 +26881,6 @@
       <w:r>
         <w:t xml:space="preserve"> Uso de </w:t>
       </w:r>
-      <w:proofErr w:type="spellStart"/>
       <w:r>
         <w:rPr>
           <w:b/>
@@ -28202,7 +26888,6 @@
         </w:rPr>
         <w:t>JMeter</w:t>
       </w:r>
-      <w:proofErr w:type="spellEnd"/>
       <w:r>
         <w:t xml:space="preserve"> para simular múltiples conexiones simultáneas al módulo de voz y verificar la estabilidad de los WebSockets bajo carga. </w:t>
       </w:r>
@@ -28324,23 +27009,7 @@
           <w:b/>
           <w:bCs/>
         </w:rPr>
-        <w:t xml:space="preserve">Orquestación y Ciclo de Vida (Docker </w:t>
-      </w:r>
-      <w:proofErr w:type="spellStart"/>
-      <w:r>
-        <w:rPr>
-          <w:b/>
-          <w:bCs/>
-        </w:rPr>
-        <w:t>Compose</w:t>
-      </w:r>
-      <w:proofErr w:type="spellEnd"/>
-      <w:r>
-        <w:rPr>
-          <w:b/>
-          <w:bCs/>
-        </w:rPr>
-        <w:t>)</w:t>
+        <w:t>Orquestación y Ciclo de Vida (Docker Compose)</w:t>
       </w:r>
     </w:p>
     <w:p>
@@ -28349,31 +27018,7 @@
       </w:pPr>
       <w:r>
         <w:lastRenderedPageBreak/>
-        <w:t xml:space="preserve">La orquestación de los servicios se define mediante un archivo </w:t>
-      </w:r>
-      <w:proofErr w:type="spellStart"/>
-      <w:r>
-        <w:t>docker-compose.yml</w:t>
-      </w:r>
-      <w:proofErr w:type="spellEnd"/>
-      <w:r>
-        <w:t xml:space="preserve"> que gestiona la interdependencia entre los contenedores. Se han configurado políticas de reinicio automático (</w:t>
-      </w:r>
-      <w:proofErr w:type="spellStart"/>
-      <w:r>
-        <w:t>restart</w:t>
-      </w:r>
-      <w:proofErr w:type="spellEnd"/>
-      <w:r>
-        <w:t xml:space="preserve">: </w:t>
-      </w:r>
-      <w:proofErr w:type="spellStart"/>
-      <w:r>
-        <w:t>unless-stopped</w:t>
-      </w:r>
-      <w:proofErr w:type="spellEnd"/>
-      <w:r>
-        <w:t>) para garantizar que, ante un fallo crítico o reinicio del servidor host, los servicios de backend y bases de datos se recuperen automáticamente sin intervención manual (Self-Healing).</w:t>
+        <w:t>La orquestación de los servicios se define mediante un archivo docker-compose.yml que gestiona la interdependencia entre los contenedores. Se han configurado políticas de reinicio automático (restart: unless-stopped) para garantizar que, ante un fallo crítico o reinicio del servidor host, los servicios de backend y bases de datos se recuperen automáticamente sin intervención manual (Self-Healing).</w:t>
       </w:r>
     </w:p>
     <w:p>
@@ -28413,66 +27058,10 @@
           <w:b/>
           <w:bCs/>
         </w:rPr>
-        <w:t xml:space="preserve">Verificaciones de Salud (Health </w:t>
-      </w:r>
-      <w:proofErr w:type="spellStart"/>
-      <w:r>
-        <w:rPr>
-          <w:b/>
-          <w:bCs/>
-        </w:rPr>
-        <w:t>Checks</w:t>
-      </w:r>
-      <w:proofErr w:type="spellEnd"/>
-      <w:r>
-        <w:rPr>
-          <w:b/>
-          <w:bCs/>
-        </w:rPr>
-        <w:t>):</w:t>
-      </w:r>
-      <w:r>
-        <w:t xml:space="preserve"> Se configuran sondas de salud en los contenedores de base de datos (SQL Server, MongoDB). Los servicios dependientes (</w:t>
-      </w:r>
-      <w:proofErr w:type="spellStart"/>
-      <w:r>
-        <w:t>Backends</w:t>
-      </w:r>
-      <w:proofErr w:type="spellEnd"/>
-      <w:r>
-        <w:t xml:space="preserve">) esperan mediante la directiva </w:t>
-      </w:r>
-      <w:proofErr w:type="spellStart"/>
-      <w:r>
-        <w:t>depends_on</w:t>
-      </w:r>
-      <w:proofErr w:type="spellEnd"/>
-      <w:r>
-        <w:t xml:space="preserve">: </w:t>
-      </w:r>
-      <w:proofErr w:type="spellStart"/>
-      <w:r>
-        <w:t>condition</w:t>
-      </w:r>
-      <w:proofErr w:type="spellEnd"/>
-      <w:r>
-        <w:t xml:space="preserve">: </w:t>
-      </w:r>
-      <w:proofErr w:type="spellStart"/>
-      <w:r>
-        <w:t>service_healthy</w:t>
-      </w:r>
-      <w:proofErr w:type="spellEnd"/>
-      <w:r>
-        <w:t xml:space="preserve"> hasta que la persistencia esté totalmente operativa, evitando errores de conexión durante el arranque (</w:t>
-      </w:r>
-      <w:proofErr w:type="spellStart"/>
-      <w:r>
-        <w:t>Cold</w:t>
-      </w:r>
-      <w:proofErr w:type="spellEnd"/>
-      <w:r>
-        <w:t xml:space="preserve"> Start).</w:t>
+        <w:t>Verificaciones de Salud (Health Checks):</w:t>
+      </w:r>
+      <w:r>
+        <w:t xml:space="preserve"> Se configuran sondas de salud en los contenedores de base de datos (SQL Server, MongoDB). Los servicios dependientes (Backends) esperan mediante la directiva depends_on: condition: service_healthy hasta que la persistencia esté totalmente operativa, evitando errores de conexión durante el arranque (Cold Start).</w:t>
       </w:r>
     </w:p>
     <w:p>
@@ -28491,31 +27080,7 @@
         <w:t>Resiliencia Transitoria (Polly en .NET):</w:t>
       </w:r>
       <w:r>
-        <w:t xml:space="preserve"> Se utiliza la librería Polly y la resiliencia nativa de </w:t>
-      </w:r>
-      <w:proofErr w:type="spellStart"/>
-      <w:r>
-        <w:t>Entity</w:t>
-      </w:r>
-      <w:proofErr w:type="spellEnd"/>
-      <w:r>
-        <w:t xml:space="preserve"> Framework Core (</w:t>
-      </w:r>
-      <w:proofErr w:type="spellStart"/>
-      <w:r>
-        <w:t>EnableRetryOnFailure</w:t>
-      </w:r>
-      <w:proofErr w:type="spellEnd"/>
-      <w:r>
-        <w:t xml:space="preserve">) para manejar </w:t>
-      </w:r>
-      <w:proofErr w:type="spellStart"/>
-      <w:r>
-        <w:t>micro-cortes</w:t>
-      </w:r>
-      <w:proofErr w:type="spellEnd"/>
-      <w:r>
-        <w:t xml:space="preserve"> de red. El sistema reintenta automáticamente las operaciones fallidas contra la base de datos antes de reportar un error al usuario.</w:t>
+        <w:t xml:space="preserve"> Se utiliza la librería Polly y la resiliencia nativa de Entity Framework Core (EnableRetryOnFailure) para manejar micro-cortes de red. El sistema reintenta automáticamente las operaciones fallidas contra la base de datos antes de reportar un error al usuario.</w:t>
       </w:r>
     </w:p>
     <w:p>
@@ -28563,15 +27128,7 @@
       </w:pPr>
       <w:bookmarkStart w:id="47" w:name="_Toc222750904"/>
       <w:r>
-        <w:t xml:space="preserve">Apéndice A: </w:t>
-      </w:r>
-      <w:proofErr w:type="spellStart"/>
-      <w:r>
-        <w:t>Roadmap</w:t>
-      </w:r>
-      <w:proofErr w:type="spellEnd"/>
-      <w:r>
-        <w:t xml:space="preserve"> Tecnológico y Evolución a Producto Comercial (Layla 2.0)</w:t>
+        <w:t>Apéndice A: Roadmap Tecnológico y Evolución a Producto Comercial (Layla 2.0)</w:t>
       </w:r>
       <w:bookmarkEnd w:id="47"/>
     </w:p>
@@ -28643,23 +27200,7 @@
           <w:b/>
           <w:bCs/>
         </w:rPr>
-        <w:t xml:space="preserve">Unificación del Código (Code </w:t>
-      </w:r>
-      <w:proofErr w:type="spellStart"/>
-      <w:r>
-        <w:rPr>
-          <w:b/>
-          <w:bCs/>
-        </w:rPr>
-        <w:t>Sharing</w:t>
-      </w:r>
-      <w:proofErr w:type="spellEnd"/>
-      <w:r>
-        <w:rPr>
-          <w:b/>
-          <w:bCs/>
-        </w:rPr>
-        <w:t>)</w:t>
+        <w:t>Unificación del Código (Code Sharing)</w:t>
       </w:r>
       <w:r>
         <w:t xml:space="preserve"> para reducir la deuda técnica y acelerar el despliegue de nuevas funcionalidades.</w:t>
@@ -28688,21 +27229,12 @@
       <w:r>
         <w:t xml:space="preserve">El objetivo de la siguiente iteración será migrar de un ecosistema fragmentado a un </w:t>
       </w:r>
-      <w:proofErr w:type="spellStart"/>
       <w:r>
         <w:rPr>
           <w:b/>
           <w:bCs/>
         </w:rPr>
-        <w:t>Monorepo</w:t>
-      </w:r>
-      <w:proofErr w:type="spellEnd"/>
-      <w:r>
-        <w:rPr>
-          <w:b/>
-          <w:bCs/>
-        </w:rPr>
-        <w:t xml:space="preserve"> basado en TypeScript</w:t>
+        <w:t>Monorepo basado en TypeScript</w:t>
       </w:r>
       <w:r>
         <w:t>, manteniendo la robustez del Backend actual, pero unificando las tres interfaces de usuario (Web, Escritorio, Móvil).</w:t>
@@ -29018,53 +27550,63 @@
                 <w:b/>
                 <w:bCs/>
               </w:rPr>
-              <w:t xml:space="preserve">Capacitor / </w:t>
-            </w:r>
-            <w:proofErr w:type="spellStart"/>
+              <w:t>Capacitor / Ionic</w:t>
+            </w:r>
+          </w:p>
+        </w:tc>
+        <w:tc>
+          <w:tcPr>
+            <w:tcW w:w="0" w:type="auto"/>
+            <w:hideMark/>
+          </w:tcPr>
+          <w:p>
+            <w:pPr>
+              <w:spacing w:after="160" w:line="278" w:lineRule="auto"/>
+              <w:cnfStyle w:val="000000100000" w:firstRow="0" w:lastRow="0" w:firstColumn="0" w:lastColumn="0" w:oddVBand="0" w:evenVBand="0" w:oddHBand="1" w:evenHBand="0" w:firstRowFirstColumn="0" w:firstRowLastColumn="0" w:lastRowFirstColumn="0" w:lastRowLastColumn="0"/>
+            </w:pPr>
+            <w:r>
+              <w:t xml:space="preserve">Permitir el despliegue simultáneo en iOS y Android utilizando la misma base de código web, reduciendo el </w:t>
+            </w:r>
+            <w:r>
+              <w:lastRenderedPageBreak/>
+              <w:t>equipo de desarrollo necesario.</w:t>
+            </w:r>
+          </w:p>
+        </w:tc>
+      </w:tr>
+      <w:tr>
+        <w:tc>
+          <w:tcPr>
+            <w:cnfStyle w:val="001000000000" w:firstRow="0" w:lastRow="0" w:firstColumn="1" w:lastColumn="0" w:oddVBand="0" w:evenVBand="0" w:oddHBand="0" w:evenHBand="0" w:firstRowFirstColumn="0" w:firstRowLastColumn="0" w:lastRowFirstColumn="0" w:lastRowLastColumn="0"/>
+            <w:tcW w:w="0" w:type="auto"/>
+            <w:hideMark/>
+          </w:tcPr>
+          <w:p>
+            <w:pPr>
+              <w:spacing w:after="160" w:line="278" w:lineRule="auto"/>
+            </w:pPr>
+            <w:r>
+              <w:lastRenderedPageBreak/>
+              <w:t>Protocolo de Voz</w:t>
+            </w:r>
+          </w:p>
+        </w:tc>
+        <w:tc>
+          <w:tcPr>
+            <w:tcW w:w="0" w:type="auto"/>
+            <w:hideMark/>
+          </w:tcPr>
+          <w:p>
+            <w:pPr>
+              <w:spacing w:after="160" w:line="278" w:lineRule="auto"/>
+              <w:cnfStyle w:val="000000000000" w:firstRow="0" w:lastRow="0" w:firstColumn="0" w:lastColumn="0" w:oddVBand="0" w:evenVBand="0" w:oddHBand="0" w:evenHBand="0" w:firstRowFirstColumn="0" w:firstRowLastColumn="0" w:lastRowFirstColumn="0" w:lastRowLastColumn="0"/>
+            </w:pPr>
             <w:r>
               <w:rPr>
                 <w:b/>
                 <w:bCs/>
               </w:rPr>
-              <w:t>Ionic</w:t>
-            </w:r>
-            <w:proofErr w:type="spellEnd"/>
-          </w:p>
-        </w:tc>
-        <w:tc>
-          <w:tcPr>
-            <w:tcW w:w="0" w:type="auto"/>
-            <w:hideMark/>
-          </w:tcPr>
-          <w:p>
-            <w:pPr>
-              <w:spacing w:after="160" w:line="278" w:lineRule="auto"/>
-              <w:cnfStyle w:val="000000100000" w:firstRow="0" w:lastRow="0" w:firstColumn="0" w:lastColumn="0" w:oddVBand="0" w:evenVBand="0" w:oddHBand="1" w:evenHBand="0" w:firstRowFirstColumn="0" w:firstRowLastColumn="0" w:lastRowFirstColumn="0" w:lastRowLastColumn="0"/>
-            </w:pPr>
-            <w:r>
-              <w:t xml:space="preserve">Permitir el despliegue simultáneo en iOS y Android utilizando la misma base de código web, reduciendo el </w:t>
-            </w:r>
-            <w:r>
-              <w:lastRenderedPageBreak/>
-              <w:t>equipo de desarrollo necesario.</w:t>
-            </w:r>
-          </w:p>
-        </w:tc>
-      </w:tr>
-      <w:tr>
-        <w:tc>
-          <w:tcPr>
-            <w:cnfStyle w:val="001000000000" w:firstRow="0" w:lastRow="0" w:firstColumn="1" w:lastColumn="0" w:oddVBand="0" w:evenVBand="0" w:oddHBand="0" w:evenHBand="0" w:firstRowFirstColumn="0" w:firstRowLastColumn="0" w:lastRowFirstColumn="0" w:lastRowLastColumn="0"/>
-            <w:tcW w:w="0" w:type="auto"/>
-            <w:hideMark/>
-          </w:tcPr>
-          <w:p>
-            <w:pPr>
-              <w:spacing w:after="160" w:line="278" w:lineRule="auto"/>
-            </w:pPr>
-            <w:r>
-              <w:lastRenderedPageBreak/>
-              <w:t>Protocolo de Voz</w:t>
+              <w:t>WebSockets (TCP Raw)</w:t>
             </w:r>
           </w:p>
         </w:tc>
@@ -29083,7 +27625,7 @@
                 <w:b/>
                 <w:bCs/>
               </w:rPr>
-              <w:t>WebSockets (TCP Raw)</w:t>
+              <w:t>WebRTC</w:t>
             </w:r>
           </w:p>
         </w:tc>
@@ -29098,34 +27640,7 @@
               <w:cnfStyle w:val="000000000000" w:firstRow="0" w:lastRow="0" w:firstColumn="0" w:lastColumn="0" w:oddVBand="0" w:evenVBand="0" w:oddHBand="0" w:evenHBand="0" w:firstRowFirstColumn="0" w:firstRowLastColumn="0" w:lastRowFirstColumn="0" w:lastRowLastColumn="0"/>
             </w:pPr>
             <w:r>
-              <w:rPr>
-                <w:b/>
-                <w:bCs/>
-              </w:rPr>
-              <w:t>WebRTC</w:t>
-            </w:r>
-          </w:p>
-        </w:tc>
-        <w:tc>
-          <w:tcPr>
-            <w:tcW w:w="0" w:type="auto"/>
-            <w:hideMark/>
-          </w:tcPr>
-          <w:p>
-            <w:pPr>
-              <w:spacing w:after="160" w:line="278" w:lineRule="auto"/>
-              <w:cnfStyle w:val="000000000000" w:firstRow="0" w:lastRow="0" w:firstColumn="0" w:lastColumn="0" w:oddVBand="0" w:evenVBand="0" w:oddHBand="0" w:evenHBand="0" w:firstRowFirstColumn="0" w:firstRowLastColumn="0" w:lastRowFirstColumn="0" w:lastRowLastColumn="0"/>
-            </w:pPr>
-            <w:r>
-              <w:t>Adoptar el estándar industrial para comunicación en tiempo real (P2P), delegando la gestión de códecs, cancelación de eco y latencia al navegador/</w:t>
-            </w:r>
-            <w:proofErr w:type="spellStart"/>
-            <w:r>
-              <w:t>WebView</w:t>
-            </w:r>
-            <w:proofErr w:type="spellEnd"/>
-            <w:r>
-              <w:t>.</w:t>
+              <w:t>Adoptar el estándar industrial para comunicación en tiempo real (P2P), delegando la gestión de códecs, cancelación de eco y latencia al navegador/WebView.</w:t>
             </w:r>
           </w:p>
         </w:tc>
@@ -29232,23 +27747,7 @@
               <w:t>10</w:t>
             </w:r>
             <w:r>
-              <w:t xml:space="preserve"> (</w:t>
-            </w:r>
-            <w:proofErr w:type="spellStart"/>
-            <w:r>
-              <w:t>Minimal</w:t>
-            </w:r>
-            <w:proofErr w:type="spellEnd"/>
-            <w:r>
-              <w:t xml:space="preserve"> </w:t>
-            </w:r>
-            <w:proofErr w:type="spellStart"/>
-            <w:r>
-              <w:t>APIs</w:t>
-            </w:r>
-            <w:proofErr w:type="spellEnd"/>
-            <w:r>
-              <w:t>) para simplificar la infraestructura de despliegue.</w:t>
+              <w:t xml:space="preserve"> (Minimal APIs) para simplificar la infraestructura de despliegue.</w:t>
             </w:r>
           </w:p>
         </w:tc>
@@ -29283,15 +27782,7 @@
         <w:jc w:val="both"/>
       </w:pPr>
       <w:r>
-        <w:t xml:space="preserve">La transición hacia Layla 2.0 se ejecutará en tres fases </w:t>
-      </w:r>
-      <w:proofErr w:type="spellStart"/>
-      <w:r>
-        <w:t>post-académicas</w:t>
-      </w:r>
-      <w:proofErr w:type="spellEnd"/>
-      <w:r>
-        <w:t>:</w:t>
+        <w:t>La transición hacia Layla 2.0 se ejecutará en tres fases post-académicas:</w:t>
       </w:r>
     </w:p>
     <w:p>
@@ -29307,23 +27798,7 @@
           <w:b/>
           <w:bCs/>
         </w:rPr>
-        <w:t>Fase de Unificación de UI (</w:t>
-      </w:r>
-      <w:proofErr w:type="spellStart"/>
-      <w:r>
-        <w:rPr>
-          <w:b/>
-          <w:bCs/>
-        </w:rPr>
-        <w:t>Frontend</w:t>
-      </w:r>
-      <w:proofErr w:type="spellEnd"/>
-      <w:r>
-        <w:rPr>
-          <w:b/>
-          <w:bCs/>
-        </w:rPr>
-        <w:t>):</w:t>
+        <w:t>Fase de Unificación de UI (Frontend):</w:t>
       </w:r>
       <w:r>
         <w:t xml:space="preserve"> Desarrollo de una biblioteca de componentes de interfaz en </w:t>
@@ -29394,15 +27869,7 @@
         <w:t>WebRTC</w:t>
       </w:r>
       <w:r>
-        <w:t>, mejorando la calidad de audio y reduciendo la carga en el servidor central (Server-Load) al pasar a una topología Peer-</w:t>
-      </w:r>
-      <w:proofErr w:type="spellStart"/>
-      <w:r>
-        <w:t>to</w:t>
-      </w:r>
-      <w:proofErr w:type="spellEnd"/>
-      <w:r>
-        <w:t>-Peer donde sea posible.</w:t>
+        <w:t>, mejorando la calidad de audio y reduciendo la carga en el servidor central (Server-Load) al pasar a una topología Peer-to-Peer donde sea posible.</w:t>
       </w:r>
     </w:p>
     <w:p>
@@ -29433,39 +27900,7 @@
           <w:b/>
           <w:bCs/>
         </w:rPr>
-        <w:t>Eficiencia del Desarrollador (</w:t>
-      </w:r>
-      <w:proofErr w:type="spellStart"/>
-      <w:r>
-        <w:rPr>
-          <w:b/>
-          <w:bCs/>
-        </w:rPr>
-        <w:t>Developer</w:t>
-      </w:r>
-      <w:proofErr w:type="spellEnd"/>
-      <w:r>
-        <w:rPr>
-          <w:b/>
-          <w:bCs/>
-        </w:rPr>
-        <w:t xml:space="preserve"> </w:t>
-      </w:r>
-      <w:proofErr w:type="spellStart"/>
-      <w:r>
-        <w:rPr>
-          <w:b/>
-          <w:bCs/>
-        </w:rPr>
-        <w:t>Experience</w:t>
-      </w:r>
-      <w:proofErr w:type="spellEnd"/>
-      <w:r>
-        <w:rPr>
-          <w:b/>
-          <w:bCs/>
-        </w:rPr>
-        <w:t>)</w:t>
+        <w:t>Eficiencia del Desarrollador (Developer Experience)</w:t>
       </w:r>
       <w:r>
         <w:t xml:space="preserve"> y la </w:t>

</xml_diff>